<commit_message>
Add Synchronization & Wait type and Take Screenshots folders with notes and scripts
</commit_message>
<xml_diff>
--- a/SELENIUM/Folder 1 - Initial Lab Work and Video Demonstrations/week1/Locators and Object identification/Locators_and_Object_identification.docx
+++ b/SELENIUM/Folder 1 - Initial Lab Work and Video Demonstrations/week1/Locators and Object identification/Locators_and_Object_identification.docx
@@ -7,18 +7,26 @@
         <w:jc w:val="center"/>
         <w:rPr>
           <w:rFonts w:hint="default" w:ascii="Times New Roman" w:hAnsi="Times New Roman" w:cs="Times New Roman"/>
+          <w:b w:val="0"/>
+          <w:bCs w:val="0"/>
           <w:sz w:val="52"/>
           <w:szCs w:val="52"/>
-        </w:rPr>
-      </w:pPr>
-      <w:r>
-        <w:rPr>
-          <w:rFonts w:hint="default" w:ascii="Times New Roman" w:hAnsi="Times New Roman" w:cs="Times New Roman"/>
+          <w:u w:val="single"/>
+        </w:rPr>
+      </w:pPr>
+      <w:r>
+        <w:rPr>
+          <w:rFonts w:hint="default" w:ascii="Times New Roman" w:hAnsi="Times New Roman" w:cs="Times New Roman"/>
+          <w:b w:val="0"/>
+          <w:bCs w:val="0"/>
           <w:sz w:val="52"/>
           <w:szCs w:val="52"/>
+          <w:u w:val="single"/>
         </w:rPr>
         <w:t>LOCATORS AND OBJECT IDENTIFICATION</w:t>
       </w:r>
+      <w:bookmarkStart w:id="0" w:name="_GoBack"/>
+      <w:bookmarkEnd w:id="0"/>
     </w:p>
     <w:p>
       <w:pPr>
@@ -128,23 +136,7 @@
           <w:sz w:val="22"/>
           <w:szCs w:val="22"/>
         </w:rPr>
-        <w:t xml:space="preserve">A </w:t>
-      </w:r>
-      <w:r>
-        <w:rPr>
-          <w:rFonts w:hint="default" w:ascii="Times New Roman" w:hAnsi="Times New Roman" w:cs="Times New Roman"/>
-          <w:sz w:val="22"/>
-          <w:szCs w:val="22"/>
-        </w:rPr>
-        <w:t>Web Element Locator</w:t>
-      </w:r>
-      <w:r>
-        <w:rPr>
-          <w:rFonts w:hint="default" w:ascii="Times New Roman" w:hAnsi="Times New Roman" w:cs="Times New Roman"/>
-          <w:sz w:val="22"/>
-          <w:szCs w:val="22"/>
-        </w:rPr>
-        <w:t xml:space="preserve"> is used in Selenium to identify and interact with web elements such as:</w:t>
+        <w:t>A Web Element Locator is used in Selenium to identify and interact with web elements such as:</w:t>
       </w:r>
       <w:r>
         <w:rPr>
@@ -573,6 +565,7 @@
         <w:keepLines w:val="0"/>
         <w:widowControl/>
         <w:numPr>
+          <w:ilvl w:val="0"/>
           <w:numId w:val="0"/>
         </w:numPr>
         <w:suppressLineNumbers w:val="0"/>
@@ -819,6 +812,7 @@
         <w:keepLines w:val="0"/>
         <w:widowControl/>
         <w:numPr>
+          <w:ilvl w:val="0"/>
           <w:numId w:val="0"/>
         </w:numPr>
         <w:suppressLineNumbers w:val="0"/>
@@ -883,17 +877,7 @@
           <w:sz w:val="22"/>
           <w:szCs w:val="22"/>
         </w:rPr>
-        <w:t>se</w:t>
-      </w:r>
-      <w:r>
-        <w:rPr>
-          <w:rFonts w:hint="default" w:ascii="Times New Roman" w:hAnsi="Times New Roman" w:cs="Times New Roman"/>
-          <w:b w:val="0"/>
-          <w:bCs w:val="0"/>
-          <w:sz w:val="22"/>
-          <w:szCs w:val="22"/>
-        </w:rPr>
-        <w:t xml:space="preserve"> </w:t>
+        <w:t xml:space="preserve">se </w:t>
       </w:r>
       <w:r>
         <w:rPr>
@@ -2067,6 +2051,7 @@
         <w:keepLines w:val="0"/>
         <w:widowControl/>
         <w:numPr>
+          <w:ilvl w:val="0"/>
           <w:numId w:val="0"/>
         </w:numPr>
         <w:suppressLineNumbers w:val="0"/>
@@ -2239,6 +2224,7 @@
         <w:keepLines w:val="0"/>
         <w:widowControl/>
         <w:numPr>
+          <w:ilvl w:val="0"/>
           <w:numId w:val="0"/>
         </w:numPr>
         <w:suppressLineNumbers w:val="0"/>
@@ -4112,6 +4098,7 @@
         <w:keepLines w:val="0"/>
         <w:widowControl/>
         <w:numPr>
+          <w:ilvl w:val="0"/>
           <w:numId w:val="0"/>
         </w:numPr>
         <w:suppressLineNumbers w:val="0"/>
@@ -4202,6 +4189,7 @@
         <w:keepLines w:val="0"/>
         <w:widowControl/>
         <w:numPr>
+          <w:ilvl w:val="0"/>
           <w:numId w:val="0"/>
         </w:numPr>
         <w:suppressLineNumbers w:val="0"/>
@@ -4396,6 +4384,7 @@
         <w:keepLines w:val="0"/>
         <w:widowControl/>
         <w:numPr>
+          <w:ilvl w:val="0"/>
           <w:numId w:val="0"/>
         </w:numPr>
         <w:suppressLineNumbers w:val="0"/>
@@ -4442,6 +4431,7 @@
         <w:keepLines w:val="0"/>
         <w:widowControl/>
         <w:numPr>
+          <w:ilvl w:val="0"/>
           <w:numId w:val="0"/>
         </w:numPr>
         <w:suppressLineNumbers w:val="0"/>
@@ -4486,6 +4476,7 @@
         <w:keepLines w:val="0"/>
         <w:widowControl/>
         <w:numPr>
+          <w:ilvl w:val="0"/>
           <w:numId w:val="0"/>
         </w:numPr>
         <w:suppressLineNumbers w:val="0"/>
@@ -4532,6 +4523,7 @@
         <w:keepLines w:val="0"/>
         <w:widowControl/>
         <w:numPr>
+          <w:ilvl w:val="0"/>
           <w:numId w:val="0"/>
         </w:numPr>
         <w:suppressLineNumbers w:val="0"/>
@@ -4578,6 +4570,7 @@
         <w:keepLines w:val="0"/>
         <w:widowControl/>
         <w:numPr>
+          <w:ilvl w:val="0"/>
           <w:numId w:val="0"/>
         </w:numPr>
         <w:suppressLineNumbers w:val="0"/>
@@ -4607,6 +4600,7 @@
         <w:keepLines w:val="0"/>
         <w:widowControl/>
         <w:numPr>
+          <w:ilvl w:val="0"/>
           <w:numId w:val="0"/>
         </w:numPr>
         <w:suppressLineNumbers w:val="0"/>
@@ -4651,6 +4645,7 @@
         <w:keepLines w:val="0"/>
         <w:widowControl/>
         <w:numPr>
+          <w:ilvl w:val="0"/>
           <w:numId w:val="0"/>
         </w:numPr>
         <w:suppressLineNumbers w:val="0"/>
@@ -4697,6 +4692,7 @@
         <w:keepLines w:val="0"/>
         <w:widowControl/>
         <w:numPr>
+          <w:ilvl w:val="0"/>
           <w:numId w:val="0"/>
         </w:numPr>
         <w:suppressLineNumbers w:val="0"/>
@@ -5273,6 +5269,7 @@
         <w:keepLines w:val="0"/>
         <w:widowControl/>
         <w:numPr>
+          <w:ilvl w:val="0"/>
           <w:numId w:val="0"/>
         </w:numPr>
         <w:suppressLineNumbers w:val="0"/>
@@ -5311,544 +5308,6 @@
           </w14:textFill>
         </w:rPr>
         <w:t>&lt;!-- This element has two classes: "btn" and "btn-success" --&gt;</w:t>
-      </w:r>
-    </w:p>
-    <w:p>
-      <w:pPr>
-        <w:keepNext w:val="0"/>
-        <w:keepLines w:val="0"/>
-        <w:widowControl/>
-        <w:numPr>
-          <w:numId w:val="0"/>
-        </w:numPr>
-        <w:suppressLineNumbers w:val="0"/>
-        <w:pBdr>
-          <w:bottom w:val="none" w:color="EEF0FF" w:sz="0" w:space="0"/>
-        </w:pBdr>
-        <w:spacing w:before="0" w:beforeAutospacing="0" w:after="144" w:afterAutospacing="0"/>
-        <w:ind w:right="0" w:rightChars="0"/>
-        <w:jc w:val="both"/>
-        <w:rPr>
-          <w:rFonts w:hint="default" w:ascii="Times New Roman" w:hAnsi="Times New Roman" w:eastAsia="Arial" w:cs="Times New Roman"/>
-          <w:color w:val="000000" w:themeColor="text1"/>
-          <w:sz w:val="22"/>
-          <w:szCs w:val="22"/>
-          <w:highlight w:val="cyan"/>
-          <w:u w:val="none"/>
-          <w14:textFill>
-            <w14:solidFill>
-              <w14:schemeClr w14:val="tx1"/>
-            </w14:solidFill>
-          </w14:textFill>
-        </w:rPr>
-      </w:pPr>
-      <w:r>
-        <w:rPr>
-          <w:rFonts w:hint="default" w:ascii="Times New Roman" w:hAnsi="Times New Roman" w:eastAsia="Arial" w:cs="Times New Roman"/>
-          <w:color w:val="000000" w:themeColor="text1"/>
-          <w:sz w:val="22"/>
-          <w:szCs w:val="22"/>
-          <w:highlight w:val="cyan"/>
-          <w:u w:val="none"/>
-          <w14:textFill>
-            <w14:solidFill>
-              <w14:schemeClr w14:val="tx1"/>
-            </w14:solidFill>
-          </w14:textFill>
-        </w:rPr>
-        <w:t>&lt;button class="btn btn-success"&gt;Submit Payment&lt;/button&gt;</w:t>
-      </w:r>
-    </w:p>
-    <w:p>
-      <w:pPr>
-        <w:keepNext w:val="0"/>
-        <w:keepLines w:val="0"/>
-        <w:widowControl/>
-        <w:numPr>
-          <w:numId w:val="0"/>
-        </w:numPr>
-        <w:suppressLineNumbers w:val="0"/>
-        <w:pBdr>
-          <w:bottom w:val="none" w:color="EEF0FF" w:sz="0" w:space="0"/>
-        </w:pBdr>
-        <w:spacing w:before="0" w:beforeAutospacing="0" w:after="144" w:afterAutospacing="0"/>
-        <w:ind w:right="0" w:rightChars="0"/>
-        <w:jc w:val="both"/>
-        <w:rPr>
-          <w:rFonts w:hint="default" w:ascii="Times New Roman" w:hAnsi="Times New Roman" w:eastAsia="Arial" w:cs="Times New Roman"/>
-          <w:color w:val="000000" w:themeColor="text1"/>
-          <w:sz w:val="22"/>
-          <w:szCs w:val="22"/>
-          <w:highlight w:val="none"/>
-          <w:u w:val="none"/>
-          <w:lang w:val="en-IN"/>
-          <w14:textFill>
-            <w14:solidFill>
-              <w14:schemeClr w14:val="tx1"/>
-            </w14:solidFill>
-          </w14:textFill>
-        </w:rPr>
-      </w:pPr>
-      <w:r>
-        <w:rPr>
-          <w:rFonts w:hint="default" w:ascii="Times New Roman" w:hAnsi="Times New Roman" w:eastAsia="Arial" w:cs="Times New Roman"/>
-          <w:color w:val="000000" w:themeColor="text1"/>
-          <w:sz w:val="22"/>
-          <w:szCs w:val="22"/>
-          <w:highlight w:val="none"/>
-          <w:u w:val="none"/>
-          <w:lang w:val="en-IN"/>
-          <w14:textFill>
-            <w14:solidFill>
-              <w14:schemeClr w14:val="tx1"/>
-            </w14:solidFill>
-          </w14:textFill>
-        </w:rPr>
-        <w:t>#Python</w:t>
-      </w:r>
-    </w:p>
-    <w:p>
-      <w:pPr>
-        <w:keepNext w:val="0"/>
-        <w:keepLines w:val="0"/>
-        <w:widowControl/>
-        <w:numPr>
-          <w:numId w:val="0"/>
-        </w:numPr>
-        <w:suppressLineNumbers w:val="0"/>
-        <w:pBdr>
-          <w:bottom w:val="none" w:color="EEF0FF" w:sz="0" w:space="0"/>
-        </w:pBdr>
-        <w:spacing w:before="0" w:beforeAutospacing="0" w:after="144" w:afterAutospacing="0"/>
-        <w:ind w:right="0" w:rightChars="0"/>
-        <w:jc w:val="both"/>
-        <w:rPr>
-          <w:rFonts w:hint="default" w:ascii="Times New Roman" w:hAnsi="Times New Roman" w:eastAsia="Arial" w:cs="Times New Roman"/>
-          <w:color w:val="000000" w:themeColor="text1"/>
-          <w:sz w:val="22"/>
-          <w:szCs w:val="22"/>
-          <w:highlight w:val="red"/>
-          <w:u w:val="none"/>
-          <w14:textFill>
-            <w14:solidFill>
-              <w14:schemeClr w14:val="tx1"/>
-            </w14:solidFill>
-          </w14:textFill>
-        </w:rPr>
-      </w:pPr>
-      <w:r>
-        <w:rPr>
-          <w:rFonts w:hint="default" w:ascii="Times New Roman" w:hAnsi="Times New Roman" w:eastAsia="Arial" w:cs="Times New Roman"/>
-          <w:color w:val="000000" w:themeColor="text1"/>
-          <w:sz w:val="22"/>
-          <w:szCs w:val="22"/>
-          <w:highlight w:val="red"/>
-          <w:u w:val="none"/>
-          <w14:textFill>
-            <w14:solidFill>
-              <w14:schemeClr w14:val="tx1"/>
-            </w14:solidFill>
-          </w14:textFill>
-        </w:rPr>
-        <w:t># WRONG: This will throw an error due to the space</w:t>
-      </w:r>
-    </w:p>
-    <w:p>
-      <w:pPr>
-        <w:keepNext w:val="0"/>
-        <w:keepLines w:val="0"/>
-        <w:widowControl/>
-        <w:numPr>
-          <w:numId w:val="0"/>
-        </w:numPr>
-        <w:suppressLineNumbers w:val="0"/>
-        <w:pBdr>
-          <w:bottom w:val="none" w:color="EEF0FF" w:sz="0" w:space="0"/>
-        </w:pBdr>
-        <w:spacing w:before="0" w:beforeAutospacing="0" w:after="144" w:afterAutospacing="0"/>
-        <w:ind w:right="0" w:rightChars="0"/>
-        <w:jc w:val="both"/>
-        <w:rPr>
-          <w:rFonts w:hint="default" w:ascii="Times New Roman" w:hAnsi="Times New Roman" w:eastAsia="Arial" w:cs="Times New Roman"/>
-          <w:color w:val="000000" w:themeColor="text1"/>
-          <w:sz w:val="22"/>
-          <w:szCs w:val="22"/>
-          <w:highlight w:val="cyan"/>
-          <w:u w:val="none"/>
-          <w14:textFill>
-            <w14:solidFill>
-              <w14:schemeClr w14:val="tx1"/>
-            </w14:solidFill>
-          </w14:textFill>
-        </w:rPr>
-      </w:pPr>
-      <w:r>
-        <w:rPr>
-          <w:rFonts w:hint="default" w:ascii="Times New Roman" w:hAnsi="Times New Roman" w:eastAsia="Arial" w:cs="Times New Roman"/>
-          <w:color w:val="000000" w:themeColor="text1"/>
-          <w:sz w:val="22"/>
-          <w:szCs w:val="22"/>
-          <w:highlight w:val="cyan"/>
-          <w:u w:val="none"/>
-          <w14:textFill>
-            <w14:solidFill>
-              <w14:schemeClr w14:val="tx1"/>
-            </w14:solidFill>
-          </w14:textFill>
-        </w:rPr>
-        <w:t>submit_btn = driver.find_element(By.CLASS_NAME, "btn btn-success")</w:t>
-      </w:r>
-    </w:p>
-    <w:p>
-      <w:pPr>
-        <w:keepNext w:val="0"/>
-        <w:keepLines w:val="0"/>
-        <w:widowControl/>
-        <w:numPr>
-          <w:numId w:val="0"/>
-        </w:numPr>
-        <w:suppressLineNumbers w:val="0"/>
-        <w:pBdr>
-          <w:bottom w:val="none" w:color="EEF0FF" w:sz="0" w:space="0"/>
-        </w:pBdr>
-        <w:spacing w:before="0" w:beforeAutospacing="0" w:after="144" w:afterAutospacing="0"/>
-        <w:ind w:right="0" w:rightChars="0"/>
-        <w:jc w:val="both"/>
-        <w:rPr>
-          <w:rFonts w:hint="default" w:ascii="Times New Roman" w:hAnsi="Times New Roman" w:eastAsia="Arial" w:cs="Times New Roman"/>
-          <w:color w:val="000000" w:themeColor="text1"/>
-          <w:sz w:val="22"/>
-          <w:szCs w:val="22"/>
-          <w:highlight w:val="darkGreen"/>
-          <w:u w:val="none"/>
-          <w14:textFill>
-            <w14:solidFill>
-              <w14:schemeClr w14:val="tx1"/>
-            </w14:solidFill>
-          </w14:textFill>
-        </w:rPr>
-      </w:pPr>
-      <w:r>
-        <w:rPr>
-          <w:rFonts w:hint="default" w:ascii="Times New Roman" w:hAnsi="Times New Roman" w:eastAsia="Arial" w:cs="Times New Roman"/>
-          <w:color w:val="000000" w:themeColor="text1"/>
-          <w:sz w:val="22"/>
-          <w:szCs w:val="22"/>
-          <w:highlight w:val="darkGreen"/>
-          <w:u w:val="none"/>
-          <w14:textFill>
-            <w14:solidFill>
-              <w14:schemeClr w14:val="tx1"/>
-            </w14:solidFill>
-          </w14:textFill>
-        </w:rPr>
-        <w:t>#  CORRECT: Choose just one of the unique class names</w:t>
-      </w:r>
-    </w:p>
-    <w:p>
-      <w:pPr>
-        <w:keepNext w:val="0"/>
-        <w:keepLines w:val="0"/>
-        <w:widowControl/>
-        <w:numPr>
-          <w:numId w:val="0"/>
-        </w:numPr>
-        <w:suppressLineNumbers w:val="0"/>
-        <w:pBdr>
-          <w:bottom w:val="none" w:color="EEF0FF" w:sz="0" w:space="0"/>
-        </w:pBdr>
-        <w:spacing w:before="0" w:beforeAutospacing="0" w:after="144" w:afterAutospacing="0"/>
-        <w:ind w:right="0" w:rightChars="0"/>
-        <w:jc w:val="both"/>
-        <w:rPr>
-          <w:rFonts w:hint="default" w:ascii="Times New Roman" w:hAnsi="Times New Roman" w:eastAsia="Arial" w:cs="Times New Roman"/>
-          <w:color w:val="000000" w:themeColor="text1"/>
-          <w:sz w:val="22"/>
-          <w:szCs w:val="22"/>
-          <w:highlight w:val="cyan"/>
-          <w:u w:val="none"/>
-          <w14:textFill>
-            <w14:solidFill>
-              <w14:schemeClr w14:val="tx1"/>
-            </w14:solidFill>
-          </w14:textFill>
-        </w:rPr>
-      </w:pPr>
-      <w:r>
-        <w:rPr>
-          <w:rFonts w:hint="default" w:ascii="Times New Roman" w:hAnsi="Times New Roman" w:eastAsia="Arial" w:cs="Times New Roman"/>
-          <w:color w:val="000000" w:themeColor="text1"/>
-          <w:sz w:val="22"/>
-          <w:szCs w:val="22"/>
-          <w:highlight w:val="cyan"/>
-          <w:u w:val="none"/>
-          <w14:textFill>
-            <w14:solidFill>
-              <w14:schemeClr w14:val="tx1"/>
-            </w14:solidFill>
-          </w14:textFill>
-        </w:rPr>
-        <w:t>submit_btn = driver.find_element(By.CLASS_NAME, "btn-success")</w:t>
-      </w:r>
-    </w:p>
-    <w:p>
-      <w:pPr>
-        <w:keepNext w:val="0"/>
-        <w:keepLines w:val="0"/>
-        <w:widowControl/>
-        <w:numPr>
-          <w:numId w:val="0"/>
-        </w:numPr>
-        <w:suppressLineNumbers w:val="0"/>
-        <w:pBdr>
-          <w:bottom w:val="none" w:color="EEF0FF" w:sz="0" w:space="0"/>
-        </w:pBdr>
-        <w:spacing w:before="0" w:beforeAutospacing="0" w:after="144" w:afterAutospacing="0"/>
-        <w:ind w:right="0" w:rightChars="0"/>
-        <w:jc w:val="both"/>
-        <w:rPr>
-          <w:rFonts w:hint="default" w:ascii="Times New Roman" w:hAnsi="Times New Roman" w:eastAsia="Arial" w:cs="Times New Roman"/>
-          <w:color w:val="000000" w:themeColor="text1"/>
-          <w:sz w:val="22"/>
-          <w:szCs w:val="22"/>
-          <w:highlight w:val="cyan"/>
-          <w:u w:val="none"/>
-          <w14:textFill>
-            <w14:solidFill>
-              <w14:schemeClr w14:val="tx1"/>
-            </w14:solidFill>
-          </w14:textFill>
-        </w:rPr>
-      </w:pPr>
-      <w:r>
-        <w:rPr>
-          <w:rFonts w:hint="default" w:ascii="Times New Roman" w:hAnsi="Times New Roman" w:eastAsia="Arial" w:cs="Times New Roman"/>
-          <w:color w:val="000000" w:themeColor="text1"/>
-          <w:sz w:val="22"/>
-          <w:szCs w:val="22"/>
-          <w:highlight w:val="cyan"/>
-          <w:u w:val="none"/>
-          <w14:textFill>
-            <w14:solidFill>
-              <w14:schemeClr w14:val="tx1"/>
-            </w14:solidFill>
-          </w14:textFill>
-        </w:rPr>
-        <w:t>submit_btn.click()</w:t>
-      </w:r>
-    </w:p>
-    <w:p>
-      <w:pPr>
-        <w:spacing w:line="240" w:lineRule="auto"/>
-        <w:jc w:val="both"/>
-        <w:rPr>
-          <w:rFonts w:hint="default" w:ascii="Times New Roman" w:hAnsi="Times New Roman" w:cs="Times New Roman"/>
-          <w:b/>
-          <w:bCs/>
-          <w:sz w:val="24"/>
-          <w:szCs w:val="24"/>
-          <w:highlight w:val="yellow"/>
-          <w:u w:val="single"/>
-        </w:rPr>
-      </w:pPr>
-    </w:p>
-    <w:p>
-      <w:pPr>
-        <w:numPr>
-          <w:ilvl w:val="0"/>
-          <w:numId w:val="4"/>
-        </w:numPr>
-        <w:spacing w:line="240" w:lineRule="auto"/>
-        <w:ind w:left="0" w:leftChars="0" w:firstLine="0" w:firstLineChars="0"/>
-        <w:jc w:val="both"/>
-        <w:rPr>
-          <w:rFonts w:hint="default" w:ascii="Times New Roman" w:hAnsi="Times New Roman" w:cs="Times New Roman"/>
-          <w:b/>
-          <w:bCs/>
-          <w:sz w:val="24"/>
-          <w:szCs w:val="24"/>
-          <w:highlight w:val="yellow"/>
-          <w:u w:val="single"/>
-        </w:rPr>
-      </w:pPr>
-      <w:r>
-        <w:rPr>
-          <w:rFonts w:hint="default" w:ascii="Times New Roman" w:hAnsi="Times New Roman" w:cs="Times New Roman"/>
-          <w:b/>
-          <w:bCs/>
-          <w:sz w:val="24"/>
-          <w:szCs w:val="24"/>
-          <w:highlight w:val="yellow"/>
-          <w:u w:val="single"/>
-        </w:rPr>
-        <w:t>FIND LIST OF ELEMENTS (`find_elements`)</w:t>
-      </w:r>
-    </w:p>
-    <w:p>
-      <w:pPr>
-        <w:numPr>
-          <w:numId w:val="0"/>
-        </w:numPr>
-        <w:spacing w:line="240" w:lineRule="auto"/>
-        <w:ind w:leftChars="0"/>
-        <w:jc w:val="both"/>
-        <w:rPr>
-          <w:rFonts w:hint="default" w:ascii="Times New Roman" w:hAnsi="Times New Roman" w:cs="Times New Roman"/>
-          <w:b/>
-          <w:bCs/>
-          <w:sz w:val="24"/>
-          <w:szCs w:val="24"/>
-          <w:highlight w:val="yellow"/>
-          <w:u w:val="single"/>
-        </w:rPr>
-      </w:pPr>
-    </w:p>
-    <w:p>
-      <w:pPr>
-        <w:keepNext w:val="0"/>
-        <w:keepLines w:val="0"/>
-        <w:widowControl/>
-        <w:suppressLineNumbers w:val="0"/>
-        <w:pBdr>
-          <w:bottom w:val="none" w:color="EEF0FF" w:sz="0" w:space="0"/>
-        </w:pBdr>
-        <w:spacing w:before="144" w:beforeAutospacing="0" w:after="192" w:afterAutospacing="0"/>
-        <w:ind w:left="0" w:right="0"/>
-        <w:jc w:val="both"/>
-        <w:rPr>
-          <w:rFonts w:hint="default" w:ascii="Times New Roman" w:hAnsi="Times New Roman" w:eastAsia="Arial" w:cs="Times New Roman"/>
-          <w:b w:val="0"/>
-          <w:bCs w:val="0"/>
-          <w:kern w:val="0"/>
-          <w:sz w:val="22"/>
-          <w:szCs w:val="22"/>
-          <w:u w:val="none"/>
-          <w:lang w:val="en-IN" w:eastAsia="zh-CN" w:bidi="ar"/>
-        </w:rPr>
-      </w:pPr>
-      <w:r>
-        <w:rPr>
-          <w:rFonts w:hint="default" w:ascii="Times New Roman" w:hAnsi="Times New Roman" w:eastAsia="Arial" w:cs="Times New Roman"/>
-          <w:b w:val="0"/>
-          <w:bCs w:val="0"/>
-          <w:kern w:val="0"/>
-          <w:sz w:val="22"/>
-          <w:szCs w:val="22"/>
-          <w:u w:val="none"/>
-          <w:lang w:val="en-US" w:eastAsia="zh-CN" w:bidi="ar"/>
-        </w:rPr>
-        <w:t xml:space="preserve">To interact with a webpage using Selenium, the script first needs to locate the HTML components it wants to control. In the underlying document structure, these components are called </w:t>
-      </w:r>
-      <w:r>
-        <w:rPr>
-          <w:rStyle w:val="11"/>
-          <w:rFonts w:hint="default" w:ascii="Times New Roman" w:hAnsi="Times New Roman" w:eastAsia="Arial" w:cs="Times New Roman"/>
-          <w:b w:val="0"/>
-          <w:bCs w:val="0"/>
-          <w:kern w:val="0"/>
-          <w:sz w:val="22"/>
-          <w:szCs w:val="22"/>
-          <w:u w:val="none"/>
-          <w:lang w:val="en-US" w:eastAsia="zh-CN" w:bidi="ar"/>
-        </w:rPr>
-        <w:t>WebElements</w:t>
-      </w:r>
-      <w:r>
-        <w:rPr>
-          <w:rFonts w:hint="default" w:ascii="Times New Roman" w:hAnsi="Times New Roman" w:eastAsia="Arial" w:cs="Times New Roman"/>
-          <w:b w:val="0"/>
-          <w:bCs w:val="0"/>
-          <w:kern w:val="0"/>
-          <w:sz w:val="22"/>
-          <w:szCs w:val="22"/>
-          <w:u w:val="none"/>
-          <w:lang w:val="en-US" w:eastAsia="zh-CN" w:bidi="ar"/>
-        </w:rPr>
-        <w:t>.</w:t>
-      </w:r>
-      <w:r>
-        <w:rPr>
-          <w:rFonts w:hint="default" w:ascii="Times New Roman" w:hAnsi="Times New Roman" w:eastAsia="Arial" w:cs="Times New Roman"/>
-          <w:b w:val="0"/>
-          <w:bCs w:val="0"/>
-          <w:kern w:val="0"/>
-          <w:sz w:val="22"/>
-          <w:szCs w:val="22"/>
-          <w:u w:val="none"/>
-          <w:lang w:val="en-IN" w:eastAsia="zh-CN" w:bidi="ar"/>
-        </w:rPr>
-        <w:t xml:space="preserve"> </w:t>
-      </w:r>
-    </w:p>
-    <w:p>
-      <w:pPr>
-        <w:keepNext w:val="0"/>
-        <w:keepLines w:val="0"/>
-        <w:widowControl/>
-        <w:suppressLineNumbers w:val="0"/>
-        <w:pBdr>
-          <w:bottom w:val="none" w:color="EEF0FF" w:sz="0" w:space="0"/>
-        </w:pBdr>
-        <w:spacing w:before="144" w:beforeAutospacing="0" w:after="192" w:afterAutospacing="0"/>
-        <w:ind w:left="0" w:right="0"/>
-        <w:jc w:val="both"/>
-        <w:rPr>
-          <w:rFonts w:hint="default" w:ascii="Times New Roman" w:hAnsi="Times New Roman" w:eastAsia="Arial" w:cs="Times New Roman"/>
-          <w:b w:val="0"/>
-          <w:bCs w:val="0"/>
-          <w:sz w:val="22"/>
-          <w:szCs w:val="22"/>
-          <w:u w:val="none"/>
-        </w:rPr>
-      </w:pPr>
-      <w:r>
-        <w:rPr>
-          <w:rFonts w:hint="default" w:ascii="Times New Roman" w:hAnsi="Times New Roman" w:eastAsia="SimSun" w:cs="Times New Roman"/>
-          <w:sz w:val="22"/>
-          <w:szCs w:val="22"/>
-        </w:rPr>
-        <w:t>The Finding Mechanism:</w:t>
-      </w:r>
-      <w:r>
-        <w:rPr>
-          <w:rFonts w:hint="default" w:ascii="Times New Roman" w:hAnsi="Times New Roman" w:eastAsia="SimSun" w:cs="Times New Roman"/>
-          <w:sz w:val="22"/>
-          <w:szCs w:val="22"/>
-        </w:rPr>
-        <w:br w:type="textWrapping"/>
-      </w:r>
-      <w:r>
-        <w:rPr>
-          <w:rFonts w:hint="default" w:ascii="Times New Roman" w:hAnsi="Times New Roman" w:eastAsia="Arial" w:cs="Times New Roman"/>
-          <w:kern w:val="0"/>
-          <w:sz w:val="22"/>
-          <w:szCs w:val="22"/>
-          <w:u w:val="none"/>
-          <w:lang w:val="en-US" w:eastAsia="zh-CN" w:bidi="ar"/>
-        </w:rPr>
-        <w:t xml:space="preserve">The Selenium </w:t>
-      </w:r>
-      <w:r>
-        <w:rPr>
-          <w:rFonts w:hint="default" w:ascii="Times New Roman" w:hAnsi="Times New Roman" w:eastAsia="Arial" w:cs="Times New Roman"/>
-          <w:kern w:val="0"/>
-          <w:sz w:val="22"/>
-          <w:szCs w:val="22"/>
-          <w:u w:val="none"/>
-          <w:lang w:val="en-IN" w:eastAsia="zh-CN" w:bidi="ar"/>
-        </w:rPr>
-        <w:t>webdriver</w:t>
-      </w:r>
-      <w:r>
-        <w:rPr>
-          <w:rFonts w:hint="default" w:ascii="Times New Roman" w:hAnsi="Times New Roman" w:eastAsia="Arial" w:cs="Times New Roman"/>
-          <w:kern w:val="0"/>
-          <w:sz w:val="22"/>
-          <w:szCs w:val="22"/>
-          <w:u w:val="none"/>
-          <w:lang w:val="en-US" w:eastAsia="zh-CN" w:bidi="ar"/>
-        </w:rPr>
-        <w:t xml:space="preserve"> component provides two primary methods to locate elements on a page:</w:t>
       </w:r>
     </w:p>
     <w:p>
@@ -5869,159 +5328,33 @@
         <w:jc w:val="both"/>
         <w:rPr>
           <w:rFonts w:hint="default" w:ascii="Times New Roman" w:hAnsi="Times New Roman" w:eastAsia="Arial" w:cs="Times New Roman"/>
-          <w:i w:val="0"/>
-          <w:iCs w:val="0"/>
-          <w:sz w:val="22"/>
-          <w:szCs w:val="22"/>
-          <w:u w:val="none"/>
-          <w:lang w:val="en-IN"/>
-        </w:rPr>
-      </w:pPr>
-      <w:r>
-        <w:rPr>
-          <w:rFonts w:hint="default" w:ascii="Times New Roman" w:hAnsi="Times New Roman" w:eastAsia="Arial" w:cs="Times New Roman"/>
-          <w:b/>
-          <w:bCs/>
-          <w:i w:val="0"/>
-          <w:iCs w:val="0"/>
-          <w:sz w:val="22"/>
-          <w:szCs w:val="22"/>
-          <w:highlight w:val="green"/>
-          <w:u w:val="none"/>
-          <w:lang w:val="en-IN"/>
-        </w:rPr>
-        <w:t>findElement()</w:t>
-      </w:r>
-      <w:r>
-        <w:rPr>
-          <w:rFonts w:hint="default" w:ascii="Times New Roman" w:hAnsi="Times New Roman" w:eastAsia="Arial" w:cs="Times New Roman"/>
-          <w:b w:val="0"/>
-          <w:bCs w:val="0"/>
-          <w:i w:val="0"/>
-          <w:iCs w:val="0"/>
-          <w:sz w:val="22"/>
-          <w:szCs w:val="22"/>
-          <w:u w:val="none"/>
-          <w:lang w:val="en-IN"/>
-        </w:rPr>
-        <w:t xml:space="preserve">: </w:t>
-      </w:r>
-      <w:r>
-        <w:rPr>
-          <w:rFonts w:hint="default" w:ascii="Times New Roman" w:hAnsi="Times New Roman" w:eastAsia="SimSun" w:cs="Times New Roman"/>
-          <w:b w:val="0"/>
-          <w:bCs w:val="0"/>
-          <w:i w:val="0"/>
-          <w:iCs w:val="0"/>
-          <w:sz w:val="22"/>
-          <w:szCs w:val="22"/>
-        </w:rPr>
-        <w:t xml:space="preserve">Searches the page and returns a </w:t>
-      </w:r>
-      <w:r>
-        <w:rPr>
-          <w:rStyle w:val="11"/>
-          <w:rFonts w:hint="default" w:ascii="Times New Roman" w:hAnsi="Times New Roman" w:eastAsia="Arial" w:cs="Times New Roman"/>
-          <w:b w:val="0"/>
-          <w:bCs w:val="0"/>
-          <w:i w:val="0"/>
-          <w:iCs w:val="0"/>
-          <w:sz w:val="22"/>
-          <w:szCs w:val="22"/>
-          <w:u w:val="none"/>
-        </w:rPr>
-        <w:t>singl</w:t>
-      </w:r>
-      <w:r>
-        <w:rPr>
-          <w:rStyle w:val="11"/>
-          <w:rFonts w:hint="default" w:ascii="Times New Roman" w:hAnsi="Times New Roman" w:eastAsia="Arial" w:cs="Times New Roman"/>
-          <w:b w:val="0"/>
-          <w:bCs w:val="0"/>
-          <w:i w:val="0"/>
-          <w:iCs w:val="0"/>
-          <w:sz w:val="22"/>
-          <w:szCs w:val="22"/>
-          <w:u w:val="none"/>
-          <w:lang w:val="en-IN"/>
-        </w:rPr>
-        <w:t xml:space="preserve">e webelement </w:t>
-      </w:r>
-      <w:r>
-        <w:rPr>
-          <w:rFonts w:hint="default" w:ascii="Times New Roman" w:hAnsi="Times New Roman" w:eastAsia="SimSun" w:cs="Times New Roman"/>
-          <w:b w:val="0"/>
-          <w:bCs w:val="0"/>
-          <w:i w:val="0"/>
-          <w:iCs w:val="0"/>
-          <w:sz w:val="22"/>
-          <w:szCs w:val="22"/>
-        </w:rPr>
-        <w:t>I</w:t>
-      </w:r>
-      <w:r>
-        <w:rPr>
-          <w:rFonts w:hint="default" w:ascii="Times New Roman" w:hAnsi="Times New Roman" w:eastAsia="SimSun" w:cs="Times New Roman"/>
-          <w:i w:val="0"/>
-          <w:iCs w:val="0"/>
-          <w:sz w:val="22"/>
-          <w:szCs w:val="22"/>
-        </w:rPr>
-        <w:t xml:space="preserve">f it finds multiple elements matching your criteria, it simply returns the </w:t>
-      </w:r>
-      <w:r>
-        <w:rPr>
-          <w:rStyle w:val="7"/>
-          <w:rFonts w:hint="default" w:ascii="Times New Roman" w:hAnsi="Times New Roman" w:eastAsia="Arial" w:cs="Times New Roman"/>
-          <w:i w:val="0"/>
-          <w:iCs w:val="0"/>
-          <w:sz w:val="22"/>
-          <w:szCs w:val="22"/>
-          <w:u w:val="none"/>
-        </w:rPr>
-        <w:t>very first one</w:t>
-      </w:r>
-      <w:r>
-        <w:rPr>
-          <w:rFonts w:hint="default" w:ascii="Times New Roman" w:hAnsi="Times New Roman" w:eastAsia="SimSun" w:cs="Times New Roman"/>
-          <w:i w:val="0"/>
-          <w:iCs w:val="0"/>
-          <w:sz w:val="22"/>
-          <w:szCs w:val="22"/>
-        </w:rPr>
-        <w:t xml:space="preserve"> it encounters in the HTML tree. If no matching element is found, it throws a</w:t>
-      </w:r>
-      <w:r>
-        <w:rPr>
-          <w:rFonts w:hint="default" w:ascii="Times New Roman" w:hAnsi="Times New Roman" w:eastAsia="SimSun" w:cs="Times New Roman"/>
-          <w:i w:val="0"/>
-          <w:iCs w:val="0"/>
-          <w:sz w:val="22"/>
-          <w:szCs w:val="22"/>
-          <w:lang w:val="en-IN"/>
-        </w:rPr>
-        <w:t xml:space="preserve"> </w:t>
-      </w:r>
-      <w:r>
-        <w:rPr>
-          <w:rFonts w:hint="default" w:ascii="Times New Roman" w:hAnsi="Times New Roman" w:eastAsia="SimSun" w:cs="Times New Roman"/>
-          <w:i w:val="0"/>
-          <w:iCs w:val="0"/>
-          <w:sz w:val="22"/>
-          <w:szCs w:val="22"/>
-        </w:rPr>
-        <w:t>NoSuchElementException</w:t>
-      </w:r>
-      <w:r>
-        <w:rPr>
-          <w:rFonts w:hint="default" w:ascii="Times New Roman" w:hAnsi="Times New Roman" w:eastAsia="SimSun" w:cs="Times New Roman"/>
-          <w:i w:val="0"/>
-          <w:iCs w:val="0"/>
-          <w:sz w:val="22"/>
-          <w:szCs w:val="22"/>
-          <w:lang w:val="en-IN"/>
-        </w:rPr>
-        <w:t>.</w:t>
+          <w:color w:val="000000" w:themeColor="text1"/>
+          <w:sz w:val="22"/>
+          <w:szCs w:val="22"/>
+          <w:highlight w:val="cyan"/>
+          <w:u w:val="none"/>
+          <w14:textFill>
+            <w14:solidFill>
+              <w14:schemeClr w14:val="tx1"/>
+            </w14:solidFill>
+          </w14:textFill>
+        </w:rPr>
+      </w:pPr>
+      <w:r>
+        <w:rPr>
+          <w:rFonts w:hint="default" w:ascii="Times New Roman" w:hAnsi="Times New Roman" w:eastAsia="Arial" w:cs="Times New Roman"/>
+          <w:color w:val="000000" w:themeColor="text1"/>
+          <w:sz w:val="22"/>
+          <w:szCs w:val="22"/>
+          <w:highlight w:val="cyan"/>
+          <w:u w:val="none"/>
+          <w14:textFill>
+            <w14:solidFill>
+              <w14:schemeClr w14:val="tx1"/>
+            </w14:solidFill>
+          </w14:textFill>
+        </w:rPr>
+        <w:t>&lt;button class="btn btn-success"&gt;Submit Payment&lt;/button&gt;</w:t>
       </w:r>
     </w:p>
     <w:p>
@@ -6041,6 +5374,278 @@
         <w:ind w:right="0" w:rightChars="0"/>
         <w:jc w:val="both"/>
         <w:rPr>
+          <w:rFonts w:hint="default" w:ascii="Times New Roman" w:hAnsi="Times New Roman" w:eastAsia="Arial" w:cs="Times New Roman"/>
+          <w:color w:val="000000" w:themeColor="text1"/>
+          <w:sz w:val="22"/>
+          <w:szCs w:val="22"/>
+          <w:highlight w:val="none"/>
+          <w:u w:val="none"/>
+          <w:lang w:val="en-IN"/>
+          <w14:textFill>
+            <w14:solidFill>
+              <w14:schemeClr w14:val="tx1"/>
+            </w14:solidFill>
+          </w14:textFill>
+        </w:rPr>
+      </w:pPr>
+      <w:r>
+        <w:rPr>
+          <w:rFonts w:hint="default" w:ascii="Times New Roman" w:hAnsi="Times New Roman" w:eastAsia="Arial" w:cs="Times New Roman"/>
+          <w:color w:val="000000" w:themeColor="text1"/>
+          <w:sz w:val="22"/>
+          <w:szCs w:val="22"/>
+          <w:highlight w:val="none"/>
+          <w:u w:val="none"/>
+          <w:lang w:val="en-IN"/>
+          <w14:textFill>
+            <w14:solidFill>
+              <w14:schemeClr w14:val="tx1"/>
+            </w14:solidFill>
+          </w14:textFill>
+        </w:rPr>
+        <w:t>#Python</w:t>
+      </w:r>
+    </w:p>
+    <w:p>
+      <w:pPr>
+        <w:keepNext w:val="0"/>
+        <w:keepLines w:val="0"/>
+        <w:widowControl/>
+        <w:numPr>
+          <w:ilvl w:val="0"/>
+          <w:numId w:val="0"/>
+        </w:numPr>
+        <w:suppressLineNumbers w:val="0"/>
+        <w:pBdr>
+          <w:bottom w:val="none" w:color="EEF0FF" w:sz="0" w:space="0"/>
+        </w:pBdr>
+        <w:spacing w:before="0" w:beforeAutospacing="0" w:after="144" w:afterAutospacing="0"/>
+        <w:ind w:right="0" w:rightChars="0"/>
+        <w:jc w:val="both"/>
+        <w:rPr>
+          <w:rFonts w:hint="default" w:ascii="Times New Roman" w:hAnsi="Times New Roman" w:eastAsia="Arial" w:cs="Times New Roman"/>
+          <w:color w:val="000000" w:themeColor="text1"/>
+          <w:sz w:val="22"/>
+          <w:szCs w:val="22"/>
+          <w:highlight w:val="red"/>
+          <w:u w:val="none"/>
+          <w14:textFill>
+            <w14:solidFill>
+              <w14:schemeClr w14:val="tx1"/>
+            </w14:solidFill>
+          </w14:textFill>
+        </w:rPr>
+      </w:pPr>
+      <w:r>
+        <w:rPr>
+          <w:rFonts w:hint="default" w:ascii="Times New Roman" w:hAnsi="Times New Roman" w:eastAsia="Arial" w:cs="Times New Roman"/>
+          <w:color w:val="000000" w:themeColor="text1"/>
+          <w:sz w:val="22"/>
+          <w:szCs w:val="22"/>
+          <w:highlight w:val="red"/>
+          <w:u w:val="none"/>
+          <w14:textFill>
+            <w14:solidFill>
+              <w14:schemeClr w14:val="tx1"/>
+            </w14:solidFill>
+          </w14:textFill>
+        </w:rPr>
+        <w:t># WRONG: This will throw an error due to the space</w:t>
+      </w:r>
+    </w:p>
+    <w:p>
+      <w:pPr>
+        <w:keepNext w:val="0"/>
+        <w:keepLines w:val="0"/>
+        <w:widowControl/>
+        <w:numPr>
+          <w:ilvl w:val="0"/>
+          <w:numId w:val="0"/>
+        </w:numPr>
+        <w:suppressLineNumbers w:val="0"/>
+        <w:pBdr>
+          <w:bottom w:val="none" w:color="EEF0FF" w:sz="0" w:space="0"/>
+        </w:pBdr>
+        <w:spacing w:before="0" w:beforeAutospacing="0" w:after="144" w:afterAutospacing="0"/>
+        <w:ind w:right="0" w:rightChars="0"/>
+        <w:jc w:val="both"/>
+        <w:rPr>
+          <w:rFonts w:hint="default" w:ascii="Times New Roman" w:hAnsi="Times New Roman" w:eastAsia="Arial" w:cs="Times New Roman"/>
+          <w:color w:val="000000" w:themeColor="text1"/>
+          <w:sz w:val="22"/>
+          <w:szCs w:val="22"/>
+          <w:highlight w:val="cyan"/>
+          <w:u w:val="none"/>
+          <w14:textFill>
+            <w14:solidFill>
+              <w14:schemeClr w14:val="tx1"/>
+            </w14:solidFill>
+          </w14:textFill>
+        </w:rPr>
+      </w:pPr>
+      <w:r>
+        <w:rPr>
+          <w:rFonts w:hint="default" w:ascii="Times New Roman" w:hAnsi="Times New Roman" w:eastAsia="Arial" w:cs="Times New Roman"/>
+          <w:color w:val="000000" w:themeColor="text1"/>
+          <w:sz w:val="22"/>
+          <w:szCs w:val="22"/>
+          <w:highlight w:val="cyan"/>
+          <w:u w:val="none"/>
+          <w14:textFill>
+            <w14:solidFill>
+              <w14:schemeClr w14:val="tx1"/>
+            </w14:solidFill>
+          </w14:textFill>
+        </w:rPr>
+        <w:t>submit_btn = driver.find_element(By.CLASS_NAME, "btn btn-success")</w:t>
+      </w:r>
+    </w:p>
+    <w:p>
+      <w:pPr>
+        <w:keepNext w:val="0"/>
+        <w:keepLines w:val="0"/>
+        <w:widowControl/>
+        <w:numPr>
+          <w:ilvl w:val="0"/>
+          <w:numId w:val="0"/>
+        </w:numPr>
+        <w:suppressLineNumbers w:val="0"/>
+        <w:pBdr>
+          <w:bottom w:val="none" w:color="EEF0FF" w:sz="0" w:space="0"/>
+        </w:pBdr>
+        <w:spacing w:before="0" w:beforeAutospacing="0" w:after="144" w:afterAutospacing="0"/>
+        <w:ind w:right="0" w:rightChars="0"/>
+        <w:jc w:val="both"/>
+        <w:rPr>
+          <w:rFonts w:hint="default" w:ascii="Times New Roman" w:hAnsi="Times New Roman" w:eastAsia="Arial" w:cs="Times New Roman"/>
+          <w:color w:val="000000" w:themeColor="text1"/>
+          <w:sz w:val="22"/>
+          <w:szCs w:val="22"/>
+          <w:highlight w:val="darkGreen"/>
+          <w:u w:val="none"/>
+          <w14:textFill>
+            <w14:solidFill>
+              <w14:schemeClr w14:val="tx1"/>
+            </w14:solidFill>
+          </w14:textFill>
+        </w:rPr>
+      </w:pPr>
+      <w:r>
+        <w:rPr>
+          <w:rFonts w:hint="default" w:ascii="Times New Roman" w:hAnsi="Times New Roman" w:eastAsia="Arial" w:cs="Times New Roman"/>
+          <w:color w:val="000000" w:themeColor="text1"/>
+          <w:sz w:val="22"/>
+          <w:szCs w:val="22"/>
+          <w:highlight w:val="darkGreen"/>
+          <w:u w:val="none"/>
+          <w14:textFill>
+            <w14:solidFill>
+              <w14:schemeClr w14:val="tx1"/>
+            </w14:solidFill>
+          </w14:textFill>
+        </w:rPr>
+        <w:t>#  CORRECT: Choose just one of the unique class names</w:t>
+      </w:r>
+    </w:p>
+    <w:p>
+      <w:pPr>
+        <w:keepNext w:val="0"/>
+        <w:keepLines w:val="0"/>
+        <w:widowControl/>
+        <w:numPr>
+          <w:ilvl w:val="0"/>
+          <w:numId w:val="0"/>
+        </w:numPr>
+        <w:suppressLineNumbers w:val="0"/>
+        <w:pBdr>
+          <w:bottom w:val="none" w:color="EEF0FF" w:sz="0" w:space="0"/>
+        </w:pBdr>
+        <w:spacing w:before="0" w:beforeAutospacing="0" w:after="144" w:afterAutospacing="0"/>
+        <w:ind w:right="0" w:rightChars="0"/>
+        <w:jc w:val="both"/>
+        <w:rPr>
+          <w:rFonts w:hint="default" w:ascii="Times New Roman" w:hAnsi="Times New Roman" w:eastAsia="Arial" w:cs="Times New Roman"/>
+          <w:color w:val="000000" w:themeColor="text1"/>
+          <w:sz w:val="22"/>
+          <w:szCs w:val="22"/>
+          <w:highlight w:val="cyan"/>
+          <w:u w:val="none"/>
+          <w14:textFill>
+            <w14:solidFill>
+              <w14:schemeClr w14:val="tx1"/>
+            </w14:solidFill>
+          </w14:textFill>
+        </w:rPr>
+      </w:pPr>
+      <w:r>
+        <w:rPr>
+          <w:rFonts w:hint="default" w:ascii="Times New Roman" w:hAnsi="Times New Roman" w:eastAsia="Arial" w:cs="Times New Roman"/>
+          <w:color w:val="000000" w:themeColor="text1"/>
+          <w:sz w:val="22"/>
+          <w:szCs w:val="22"/>
+          <w:highlight w:val="cyan"/>
+          <w:u w:val="none"/>
+          <w14:textFill>
+            <w14:solidFill>
+              <w14:schemeClr w14:val="tx1"/>
+            </w14:solidFill>
+          </w14:textFill>
+        </w:rPr>
+        <w:t>submit_btn = driver.find_element(By.CLASS_NAME, "btn-success")</w:t>
+      </w:r>
+    </w:p>
+    <w:p>
+      <w:pPr>
+        <w:keepNext w:val="0"/>
+        <w:keepLines w:val="0"/>
+        <w:widowControl/>
+        <w:numPr>
+          <w:ilvl w:val="0"/>
+          <w:numId w:val="0"/>
+        </w:numPr>
+        <w:suppressLineNumbers w:val="0"/>
+        <w:pBdr>
+          <w:bottom w:val="none" w:color="EEF0FF" w:sz="0" w:space="0"/>
+        </w:pBdr>
+        <w:spacing w:before="0" w:beforeAutospacing="0" w:after="144" w:afterAutospacing="0"/>
+        <w:ind w:right="0" w:rightChars="0"/>
+        <w:jc w:val="both"/>
+        <w:rPr>
+          <w:rFonts w:hint="default" w:ascii="Times New Roman" w:hAnsi="Times New Roman" w:eastAsia="Arial" w:cs="Times New Roman"/>
+          <w:color w:val="000000" w:themeColor="text1"/>
+          <w:sz w:val="22"/>
+          <w:szCs w:val="22"/>
+          <w:highlight w:val="cyan"/>
+          <w:u w:val="none"/>
+          <w14:textFill>
+            <w14:solidFill>
+              <w14:schemeClr w14:val="tx1"/>
+            </w14:solidFill>
+          </w14:textFill>
+        </w:rPr>
+      </w:pPr>
+      <w:r>
+        <w:rPr>
+          <w:rFonts w:hint="default" w:ascii="Times New Roman" w:hAnsi="Times New Roman" w:eastAsia="Arial" w:cs="Times New Roman"/>
+          <w:color w:val="000000" w:themeColor="text1"/>
+          <w:sz w:val="22"/>
+          <w:szCs w:val="22"/>
+          <w:highlight w:val="cyan"/>
+          <w:u w:val="none"/>
+          <w14:textFill>
+            <w14:solidFill>
+              <w14:schemeClr w14:val="tx1"/>
+            </w14:solidFill>
+          </w14:textFill>
+        </w:rPr>
+        <w:t>submit_btn.click()</w:t>
+      </w:r>
+    </w:p>
+    <w:p>
+      <w:pPr>
+        <w:spacing w:line="240" w:lineRule="auto"/>
+        <w:jc w:val="both"/>
+        <w:rPr>
           <w:rFonts w:hint="default" w:ascii="Times New Roman" w:hAnsi="Times New Roman" w:cs="Times New Roman"/>
           <w:b/>
           <w:bCs/>
@@ -6050,92 +5655,58 @@
           <w:u w:val="single"/>
         </w:rPr>
       </w:pPr>
-      <w:r>
-        <w:rPr>
-          <w:rFonts w:hint="default" w:ascii="Times New Roman" w:hAnsi="Times New Roman" w:eastAsia="Arial" w:cs="Times New Roman"/>
+    </w:p>
+    <w:p>
+      <w:pPr>
+        <w:numPr>
+          <w:ilvl w:val="0"/>
+          <w:numId w:val="4"/>
+        </w:numPr>
+        <w:spacing w:line="240" w:lineRule="auto"/>
+        <w:ind w:left="0" w:leftChars="0" w:firstLine="0" w:firstLineChars="0"/>
+        <w:jc w:val="both"/>
+        <w:rPr>
+          <w:rFonts w:hint="default" w:ascii="Times New Roman" w:hAnsi="Times New Roman" w:cs="Times New Roman"/>
           <w:b/>
           <w:bCs/>
-          <w:i w:val="0"/>
-          <w:iCs w:val="0"/>
-          <w:kern w:val="0"/>
-          <w:sz w:val="22"/>
-          <w:szCs w:val="22"/>
-          <w:highlight w:val="green"/>
-          <w:u w:val="none"/>
-          <w:lang w:val="en-IN" w:eastAsia="zh-CN" w:bidi="ar"/>
-        </w:rPr>
-        <w:t>findElements()</w:t>
-      </w:r>
-      <w:r>
-        <w:rPr>
-          <w:rFonts w:hint="default" w:ascii="Times New Roman" w:hAnsi="Times New Roman" w:eastAsia="Arial" w:cs="Times New Roman"/>
-          <w:b w:val="0"/>
-          <w:bCs w:val="0"/>
-          <w:i w:val="0"/>
-          <w:iCs w:val="0"/>
-          <w:kern w:val="0"/>
-          <w:sz w:val="22"/>
-          <w:szCs w:val="22"/>
-          <w:u w:val="none"/>
-          <w:lang w:val="en-IN" w:eastAsia="zh-CN" w:bidi="ar"/>
-        </w:rPr>
-        <w:t xml:space="preserve">: </w:t>
-      </w:r>
-      <w:r>
-        <w:rPr>
-          <w:rFonts w:hint="default" w:ascii="Times New Roman" w:hAnsi="Times New Roman" w:eastAsia="Arial" w:cs="Times New Roman"/>
-          <w:b w:val="0"/>
-          <w:bCs w:val="0"/>
-          <w:i w:val="0"/>
-          <w:iCs w:val="0"/>
-          <w:sz w:val="22"/>
-          <w:szCs w:val="22"/>
-          <w:u w:val="none"/>
-        </w:rPr>
-        <w:t xml:space="preserve">Searches the page and returns a </w:t>
-      </w:r>
-      <w:r>
-        <w:rPr>
-          <w:rStyle w:val="11"/>
-          <w:rFonts w:hint="default" w:ascii="Times New Roman" w:hAnsi="Times New Roman" w:eastAsia="Arial" w:cs="Times New Roman"/>
-          <w:b w:val="0"/>
-          <w:bCs w:val="0"/>
-          <w:i w:val="0"/>
-          <w:iCs w:val="0"/>
-          <w:sz w:val="22"/>
-          <w:szCs w:val="22"/>
-          <w:u w:val="none"/>
-        </w:rPr>
-        <w:t xml:space="preserve">List/Array of </w:t>
-      </w:r>
-      <w:r>
-        <w:rPr>
-          <w:rStyle w:val="11"/>
-          <w:rFonts w:hint="default" w:ascii="Times New Roman" w:hAnsi="Times New Roman" w:eastAsia="Arial" w:cs="Times New Roman"/>
-          <w:b w:val="0"/>
-          <w:bCs w:val="0"/>
-          <w:i w:val="0"/>
-          <w:iCs w:val="0"/>
-          <w:sz w:val="22"/>
-          <w:szCs w:val="22"/>
-          <w:u w:val="none"/>
-          <w:lang w:val="en-IN"/>
-        </w:rPr>
-        <w:t>webelements</w:t>
-      </w:r>
-      <w:r>
-        <w:rPr>
-          <w:rFonts w:hint="default" w:ascii="Times New Roman" w:hAnsi="Times New Roman" w:eastAsia="Arial" w:cs="Times New Roman"/>
-          <w:b w:val="0"/>
-          <w:bCs w:val="0"/>
-          <w:i w:val="0"/>
-          <w:iCs w:val="0"/>
-          <w:sz w:val="22"/>
-          <w:szCs w:val="22"/>
-          <w:u w:val="none"/>
-        </w:rPr>
-        <w:t>. If no elements match, it returns an empty list instead of throwing an error. This is useful for counting items or iterating through tables.</w:t>
-      </w:r>
+          <w:sz w:val="24"/>
+          <w:szCs w:val="24"/>
+          <w:highlight w:val="yellow"/>
+          <w:u w:val="single"/>
+        </w:rPr>
+      </w:pPr>
+      <w:r>
+        <w:rPr>
+          <w:rFonts w:hint="default" w:ascii="Times New Roman" w:hAnsi="Times New Roman" w:cs="Times New Roman"/>
+          <w:b/>
+          <w:bCs/>
+          <w:sz w:val="24"/>
+          <w:szCs w:val="24"/>
+          <w:highlight w:val="yellow"/>
+          <w:u w:val="single"/>
+        </w:rPr>
+        <w:t>FIND LIST OF ELEMENTS (`find_elements`)</w:t>
+      </w:r>
+    </w:p>
+    <w:p>
+      <w:pPr>
+        <w:numPr>
+          <w:ilvl w:val="0"/>
+          <w:numId w:val="0"/>
+        </w:numPr>
+        <w:spacing w:line="240" w:lineRule="auto"/>
+        <w:ind w:leftChars="0"/>
+        <w:jc w:val="both"/>
+        <w:rPr>
+          <w:rFonts w:hint="default" w:ascii="Times New Roman" w:hAnsi="Times New Roman" w:cs="Times New Roman"/>
+          <w:b/>
+          <w:bCs/>
+          <w:sz w:val="24"/>
+          <w:szCs w:val="24"/>
+          <w:highlight w:val="yellow"/>
+          <w:u w:val="single"/>
+        </w:rPr>
+      </w:pPr>
     </w:p>
     <w:p>
       <w:pPr>
@@ -6151,35 +5722,67 @@
         <w:jc w:val="both"/>
         <w:rPr>
           <w:rFonts w:hint="default" w:ascii="Times New Roman" w:hAnsi="Times New Roman" w:eastAsia="Arial" w:cs="Times New Roman"/>
-          <w:color w:val="000000" w:themeColor="text1"/>
+          <w:b w:val="0"/>
+          <w:bCs w:val="0"/>
           <w:kern w:val="0"/>
           <w:sz w:val="22"/>
           <w:szCs w:val="22"/>
           <w:u w:val="none"/>
           <w:lang w:val="en-IN" w:eastAsia="zh-CN" w:bidi="ar"/>
-          <w14:textFill>
-            <w14:solidFill>
-              <w14:schemeClr w14:val="tx1"/>
-            </w14:solidFill>
-          </w14:textFill>
-        </w:rPr>
-      </w:pPr>
-      <w:r>
-        <w:rPr>
-          <w:rFonts w:hint="default" w:ascii="Times New Roman" w:hAnsi="Times New Roman" w:eastAsia="Arial" w:cs="Times New Roman"/>
-          <w:color w:val="000000" w:themeColor="text1"/>
+        </w:rPr>
+      </w:pPr>
+      <w:r>
+        <w:rPr>
+          <w:rFonts w:hint="default" w:ascii="Times New Roman" w:hAnsi="Times New Roman" w:eastAsia="Arial" w:cs="Times New Roman"/>
+          <w:b w:val="0"/>
+          <w:bCs w:val="0"/>
+          <w:kern w:val="0"/>
+          <w:sz w:val="22"/>
+          <w:szCs w:val="22"/>
+          <w:u w:val="none"/>
+          <w:lang w:val="en-US" w:eastAsia="zh-CN" w:bidi="ar"/>
+        </w:rPr>
+        <w:t xml:space="preserve">To interact with a webpage using Selenium, the script first needs to locate the HTML components it wants to control. In the underlying document structure, these components are called </w:t>
+      </w:r>
+      <w:r>
+        <w:rPr>
+          <w:rStyle w:val="11"/>
+          <w:rFonts w:hint="default" w:ascii="Times New Roman" w:hAnsi="Times New Roman" w:eastAsia="Arial" w:cs="Times New Roman"/>
+          <w:b w:val="0"/>
+          <w:bCs w:val="0"/>
+          <w:kern w:val="0"/>
+          <w:sz w:val="22"/>
+          <w:szCs w:val="22"/>
+          <w:u w:val="none"/>
+          <w:lang w:val="en-US" w:eastAsia="zh-CN" w:bidi="ar"/>
+        </w:rPr>
+        <w:t>WebElements</w:t>
+      </w:r>
+      <w:r>
+        <w:rPr>
+          <w:rFonts w:hint="default" w:ascii="Times New Roman" w:hAnsi="Times New Roman" w:eastAsia="Arial" w:cs="Times New Roman"/>
+          <w:b w:val="0"/>
+          <w:bCs w:val="0"/>
+          <w:kern w:val="0"/>
+          <w:sz w:val="22"/>
+          <w:szCs w:val="22"/>
+          <w:u w:val="none"/>
+          <w:lang w:val="en-US" w:eastAsia="zh-CN" w:bidi="ar"/>
+        </w:rPr>
+        <w:t>.</w:t>
+      </w:r>
+      <w:r>
+        <w:rPr>
+          <w:rFonts w:hint="default" w:ascii="Times New Roman" w:hAnsi="Times New Roman" w:eastAsia="Arial" w:cs="Times New Roman"/>
+          <w:b w:val="0"/>
+          <w:bCs w:val="0"/>
           <w:kern w:val="0"/>
           <w:sz w:val="22"/>
           <w:szCs w:val="22"/>
           <w:u w:val="none"/>
           <w:lang w:val="en-IN" w:eastAsia="zh-CN" w:bidi="ar"/>
-          <w14:textFill>
-            <w14:solidFill>
-              <w14:schemeClr w14:val="tx1"/>
-            </w14:solidFill>
-          </w14:textFill>
-        </w:rPr>
-        <w:t>Example:</w:t>
+        </w:rPr>
+        <w:t xml:space="preserve"> </w:t>
       </w:r>
     </w:p>
     <w:p>
@@ -6196,18 +5799,361 @@
         <w:jc w:val="both"/>
         <w:rPr>
           <w:rFonts w:hint="default" w:ascii="Times New Roman" w:hAnsi="Times New Roman" w:eastAsia="Arial" w:cs="Times New Roman"/>
-          <w:color w:val="000000" w:themeColor="text1"/>
-          <w:sz w:val="22"/>
-          <w:szCs w:val="22"/>
-          <w:u w:val="none"/>
-          <w14:textFill>
-            <w14:solidFill>
-              <w14:schemeClr w14:val="tx1"/>
-            </w14:solidFill>
-          </w14:textFill>
-        </w:rPr>
-      </w:pPr>
-      <w:r>
+          <w:b w:val="0"/>
+          <w:bCs w:val="0"/>
+          <w:sz w:val="22"/>
+          <w:szCs w:val="22"/>
+          <w:u w:val="none"/>
+        </w:rPr>
+      </w:pPr>
+      <w:r>
+        <w:rPr>
+          <w:rFonts w:hint="default" w:ascii="Times New Roman" w:hAnsi="Times New Roman" w:eastAsia="SimSun" w:cs="Times New Roman"/>
+          <w:sz w:val="22"/>
+          <w:szCs w:val="22"/>
+        </w:rPr>
+        <w:t>The Finding Mechanism:</w:t>
+      </w:r>
+      <w:r>
+        <w:rPr>
+          <w:rFonts w:hint="default" w:ascii="Times New Roman" w:hAnsi="Times New Roman" w:eastAsia="SimSun" w:cs="Times New Roman"/>
+          <w:sz w:val="22"/>
+          <w:szCs w:val="22"/>
+        </w:rPr>
+        <w:br w:type="textWrapping"/>
+      </w:r>
+      <w:r>
+        <w:rPr>
+          <w:rFonts w:hint="default" w:ascii="Times New Roman" w:hAnsi="Times New Roman" w:eastAsia="Arial" w:cs="Times New Roman"/>
+          <w:kern w:val="0"/>
+          <w:sz w:val="22"/>
+          <w:szCs w:val="22"/>
+          <w:u w:val="none"/>
+          <w:lang w:val="en-US" w:eastAsia="zh-CN" w:bidi="ar"/>
+        </w:rPr>
+        <w:t xml:space="preserve">The Selenium </w:t>
+      </w:r>
+      <w:r>
+        <w:rPr>
+          <w:rFonts w:hint="default" w:ascii="Times New Roman" w:hAnsi="Times New Roman" w:eastAsia="Arial" w:cs="Times New Roman"/>
+          <w:kern w:val="0"/>
+          <w:sz w:val="22"/>
+          <w:szCs w:val="22"/>
+          <w:u w:val="none"/>
+          <w:lang w:val="en-IN" w:eastAsia="zh-CN" w:bidi="ar"/>
+        </w:rPr>
+        <w:t>webdriver</w:t>
+      </w:r>
+      <w:r>
+        <w:rPr>
+          <w:rFonts w:hint="default" w:ascii="Times New Roman" w:hAnsi="Times New Roman" w:eastAsia="Arial" w:cs="Times New Roman"/>
+          <w:kern w:val="0"/>
+          <w:sz w:val="22"/>
+          <w:szCs w:val="22"/>
+          <w:u w:val="none"/>
+          <w:lang w:val="en-US" w:eastAsia="zh-CN" w:bidi="ar"/>
+        </w:rPr>
+        <w:t xml:space="preserve"> component provides two primary methods to locate elements on a page:</w:t>
+      </w:r>
+    </w:p>
+    <w:p>
+      <w:pPr>
+        <w:keepNext w:val="0"/>
+        <w:keepLines w:val="0"/>
+        <w:widowControl/>
+        <w:numPr>
+          <w:ilvl w:val="0"/>
+          <w:numId w:val="0"/>
+        </w:numPr>
+        <w:suppressLineNumbers w:val="0"/>
+        <w:pBdr>
+          <w:bottom w:val="none" w:color="EEF0FF" w:sz="0" w:space="0"/>
+        </w:pBdr>
+        <w:spacing w:before="0" w:beforeAutospacing="0" w:after="144" w:afterAutospacing="0"/>
+        <w:ind w:right="0" w:rightChars="0"/>
+        <w:jc w:val="both"/>
+        <w:rPr>
+          <w:rFonts w:hint="default" w:ascii="Times New Roman" w:hAnsi="Times New Roman" w:eastAsia="Arial" w:cs="Times New Roman"/>
+          <w:i w:val="0"/>
+          <w:iCs w:val="0"/>
+          <w:sz w:val="22"/>
+          <w:szCs w:val="22"/>
+          <w:u w:val="none"/>
+          <w:lang w:val="en-IN"/>
+        </w:rPr>
+      </w:pPr>
+      <w:r>
+        <w:rPr>
+          <w:rFonts w:hint="default" w:ascii="Times New Roman" w:hAnsi="Times New Roman" w:eastAsia="Arial" w:cs="Times New Roman"/>
+          <w:b/>
+          <w:bCs/>
+          <w:i w:val="0"/>
+          <w:iCs w:val="0"/>
+          <w:sz w:val="22"/>
+          <w:szCs w:val="22"/>
+          <w:highlight w:val="green"/>
+          <w:u w:val="none"/>
+          <w:lang w:val="en-IN"/>
+        </w:rPr>
+        <w:t>findElement()</w:t>
+      </w:r>
+      <w:r>
+        <w:rPr>
+          <w:rFonts w:hint="default" w:ascii="Times New Roman" w:hAnsi="Times New Roman" w:eastAsia="Arial" w:cs="Times New Roman"/>
+          <w:b w:val="0"/>
+          <w:bCs w:val="0"/>
+          <w:i w:val="0"/>
+          <w:iCs w:val="0"/>
+          <w:sz w:val="22"/>
+          <w:szCs w:val="22"/>
+          <w:u w:val="none"/>
+          <w:lang w:val="en-IN"/>
+        </w:rPr>
+        <w:t xml:space="preserve">: </w:t>
+      </w:r>
+      <w:r>
+        <w:rPr>
+          <w:rFonts w:hint="default" w:ascii="Times New Roman" w:hAnsi="Times New Roman" w:eastAsia="SimSun" w:cs="Times New Roman"/>
+          <w:b w:val="0"/>
+          <w:bCs w:val="0"/>
+          <w:i w:val="0"/>
+          <w:iCs w:val="0"/>
+          <w:sz w:val="22"/>
+          <w:szCs w:val="22"/>
+        </w:rPr>
+        <w:t xml:space="preserve">Searches the page and returns a </w:t>
+      </w:r>
+      <w:r>
+        <w:rPr>
+          <w:rStyle w:val="11"/>
+          <w:rFonts w:hint="default" w:ascii="Times New Roman" w:hAnsi="Times New Roman" w:eastAsia="Arial" w:cs="Times New Roman"/>
+          <w:b w:val="0"/>
+          <w:bCs w:val="0"/>
+          <w:i w:val="0"/>
+          <w:iCs w:val="0"/>
+          <w:sz w:val="22"/>
+          <w:szCs w:val="22"/>
+          <w:u w:val="none"/>
+        </w:rPr>
+        <w:t>singl</w:t>
+      </w:r>
+      <w:r>
+        <w:rPr>
+          <w:rStyle w:val="11"/>
+          <w:rFonts w:hint="default" w:ascii="Times New Roman" w:hAnsi="Times New Roman" w:eastAsia="Arial" w:cs="Times New Roman"/>
+          <w:b w:val="0"/>
+          <w:bCs w:val="0"/>
+          <w:i w:val="0"/>
+          <w:iCs w:val="0"/>
+          <w:sz w:val="22"/>
+          <w:szCs w:val="22"/>
+          <w:u w:val="none"/>
+          <w:lang w:val="en-IN"/>
+        </w:rPr>
+        <w:t xml:space="preserve">e webelement </w:t>
+      </w:r>
+      <w:r>
+        <w:rPr>
+          <w:rFonts w:hint="default" w:ascii="Times New Roman" w:hAnsi="Times New Roman" w:eastAsia="SimSun" w:cs="Times New Roman"/>
+          <w:b w:val="0"/>
+          <w:bCs w:val="0"/>
+          <w:i w:val="0"/>
+          <w:iCs w:val="0"/>
+          <w:sz w:val="22"/>
+          <w:szCs w:val="22"/>
+        </w:rPr>
+        <w:t>I</w:t>
+      </w:r>
+      <w:r>
+        <w:rPr>
+          <w:rFonts w:hint="default" w:ascii="Times New Roman" w:hAnsi="Times New Roman" w:eastAsia="SimSun" w:cs="Times New Roman"/>
+          <w:i w:val="0"/>
+          <w:iCs w:val="0"/>
+          <w:sz w:val="22"/>
+          <w:szCs w:val="22"/>
+        </w:rPr>
+        <w:t xml:space="preserve">f it finds multiple elements matching your criteria, it simply returns the </w:t>
+      </w:r>
+      <w:r>
+        <w:rPr>
+          <w:rStyle w:val="7"/>
+          <w:rFonts w:hint="default" w:ascii="Times New Roman" w:hAnsi="Times New Roman" w:eastAsia="Arial" w:cs="Times New Roman"/>
+          <w:i w:val="0"/>
+          <w:iCs w:val="0"/>
+          <w:sz w:val="22"/>
+          <w:szCs w:val="22"/>
+          <w:u w:val="none"/>
+        </w:rPr>
+        <w:t>very first one</w:t>
+      </w:r>
+      <w:r>
+        <w:rPr>
+          <w:rFonts w:hint="default" w:ascii="Times New Roman" w:hAnsi="Times New Roman" w:eastAsia="SimSun" w:cs="Times New Roman"/>
+          <w:i w:val="0"/>
+          <w:iCs w:val="0"/>
+          <w:sz w:val="22"/>
+          <w:szCs w:val="22"/>
+        </w:rPr>
+        <w:t xml:space="preserve"> it encounters in the HTML tree. If no matching element is found, it throws a</w:t>
+      </w:r>
+      <w:r>
+        <w:rPr>
+          <w:rFonts w:hint="default" w:ascii="Times New Roman" w:hAnsi="Times New Roman" w:eastAsia="SimSun" w:cs="Times New Roman"/>
+          <w:i w:val="0"/>
+          <w:iCs w:val="0"/>
+          <w:sz w:val="22"/>
+          <w:szCs w:val="22"/>
+          <w:lang w:val="en-IN"/>
+        </w:rPr>
+        <w:t xml:space="preserve"> </w:t>
+      </w:r>
+      <w:r>
+        <w:rPr>
+          <w:rFonts w:hint="default" w:ascii="Times New Roman" w:hAnsi="Times New Roman" w:eastAsia="SimSun" w:cs="Times New Roman"/>
+          <w:i w:val="0"/>
+          <w:iCs w:val="0"/>
+          <w:sz w:val="22"/>
+          <w:szCs w:val="22"/>
+        </w:rPr>
+        <w:t>NoSuchElementException</w:t>
+      </w:r>
+      <w:r>
+        <w:rPr>
+          <w:rFonts w:hint="default" w:ascii="Times New Roman" w:hAnsi="Times New Roman" w:eastAsia="SimSun" w:cs="Times New Roman"/>
+          <w:i w:val="0"/>
+          <w:iCs w:val="0"/>
+          <w:sz w:val="22"/>
+          <w:szCs w:val="22"/>
+          <w:lang w:val="en-IN"/>
+        </w:rPr>
+        <w:t>.</w:t>
+      </w:r>
+    </w:p>
+    <w:p>
+      <w:pPr>
+        <w:keepNext w:val="0"/>
+        <w:keepLines w:val="0"/>
+        <w:widowControl/>
+        <w:numPr>
+          <w:ilvl w:val="0"/>
+          <w:numId w:val="0"/>
+        </w:numPr>
+        <w:suppressLineNumbers w:val="0"/>
+        <w:pBdr>
+          <w:bottom w:val="none" w:color="EEF0FF" w:sz="0" w:space="0"/>
+        </w:pBdr>
+        <w:spacing w:before="0" w:beforeAutospacing="0" w:after="144" w:afterAutospacing="0"/>
+        <w:ind w:right="0" w:rightChars="0"/>
+        <w:jc w:val="both"/>
+        <w:rPr>
+          <w:rFonts w:hint="default" w:ascii="Times New Roman" w:hAnsi="Times New Roman" w:cs="Times New Roman"/>
+          <w:b/>
+          <w:bCs/>
+          <w:sz w:val="24"/>
+          <w:szCs w:val="24"/>
+          <w:highlight w:val="yellow"/>
+          <w:u w:val="single"/>
+        </w:rPr>
+      </w:pPr>
+      <w:r>
+        <w:rPr>
+          <w:rFonts w:hint="default" w:ascii="Times New Roman" w:hAnsi="Times New Roman" w:eastAsia="Arial" w:cs="Times New Roman"/>
+          <w:b/>
+          <w:bCs/>
+          <w:i w:val="0"/>
+          <w:iCs w:val="0"/>
+          <w:kern w:val="0"/>
+          <w:sz w:val="22"/>
+          <w:szCs w:val="22"/>
+          <w:highlight w:val="green"/>
+          <w:u w:val="none"/>
+          <w:lang w:val="en-IN" w:eastAsia="zh-CN" w:bidi="ar"/>
+        </w:rPr>
+        <w:t>findElements()</w:t>
+      </w:r>
+      <w:r>
+        <w:rPr>
+          <w:rFonts w:hint="default" w:ascii="Times New Roman" w:hAnsi="Times New Roman" w:eastAsia="Arial" w:cs="Times New Roman"/>
+          <w:b w:val="0"/>
+          <w:bCs w:val="0"/>
+          <w:i w:val="0"/>
+          <w:iCs w:val="0"/>
+          <w:kern w:val="0"/>
+          <w:sz w:val="22"/>
+          <w:szCs w:val="22"/>
+          <w:u w:val="none"/>
+          <w:lang w:val="en-IN" w:eastAsia="zh-CN" w:bidi="ar"/>
+        </w:rPr>
+        <w:t xml:space="preserve">: </w:t>
+      </w:r>
+      <w:r>
+        <w:rPr>
+          <w:rFonts w:hint="default" w:ascii="Times New Roman" w:hAnsi="Times New Roman" w:eastAsia="Arial" w:cs="Times New Roman"/>
+          <w:b w:val="0"/>
+          <w:bCs w:val="0"/>
+          <w:i w:val="0"/>
+          <w:iCs w:val="0"/>
+          <w:sz w:val="22"/>
+          <w:szCs w:val="22"/>
+          <w:u w:val="none"/>
+        </w:rPr>
+        <w:t xml:space="preserve">Searches the page and returns a </w:t>
+      </w:r>
+      <w:r>
+        <w:rPr>
+          <w:rStyle w:val="11"/>
+          <w:rFonts w:hint="default" w:ascii="Times New Roman" w:hAnsi="Times New Roman" w:eastAsia="Arial" w:cs="Times New Roman"/>
+          <w:b w:val="0"/>
+          <w:bCs w:val="0"/>
+          <w:i w:val="0"/>
+          <w:iCs w:val="0"/>
+          <w:sz w:val="22"/>
+          <w:szCs w:val="22"/>
+          <w:u w:val="none"/>
+        </w:rPr>
+        <w:t xml:space="preserve">List/Array of </w:t>
+      </w:r>
+      <w:r>
+        <w:rPr>
+          <w:rStyle w:val="11"/>
+          <w:rFonts w:hint="default" w:ascii="Times New Roman" w:hAnsi="Times New Roman" w:eastAsia="Arial" w:cs="Times New Roman"/>
+          <w:b w:val="0"/>
+          <w:bCs w:val="0"/>
+          <w:i w:val="0"/>
+          <w:iCs w:val="0"/>
+          <w:sz w:val="22"/>
+          <w:szCs w:val="22"/>
+          <w:u w:val="none"/>
+          <w:lang w:val="en-IN"/>
+        </w:rPr>
+        <w:t>webelements</w:t>
+      </w:r>
+      <w:r>
+        <w:rPr>
+          <w:rFonts w:hint="default" w:ascii="Times New Roman" w:hAnsi="Times New Roman" w:eastAsia="Arial" w:cs="Times New Roman"/>
+          <w:b w:val="0"/>
+          <w:bCs w:val="0"/>
+          <w:i w:val="0"/>
+          <w:iCs w:val="0"/>
+          <w:sz w:val="22"/>
+          <w:szCs w:val="22"/>
+          <w:u w:val="none"/>
+        </w:rPr>
+        <w:t>. If no elements match, it returns an empty list instead of throwing an error. This is useful for counting items or iterating through tables.</w:t>
+      </w:r>
+    </w:p>
+    <w:p>
+      <w:pPr>
+        <w:keepNext w:val="0"/>
+        <w:keepLines w:val="0"/>
+        <w:widowControl/>
+        <w:suppressLineNumbers w:val="0"/>
+        <w:pBdr>
+          <w:bottom w:val="none" w:color="EEF0FF" w:sz="0" w:space="0"/>
+        </w:pBdr>
+        <w:spacing w:before="144" w:beforeAutospacing="0" w:after="192" w:afterAutospacing="0"/>
+        <w:ind w:left="0" w:right="0"/>
+        <w:jc w:val="both"/>
         <w:rPr>
           <w:rFonts w:hint="default" w:ascii="Times New Roman" w:hAnsi="Times New Roman" w:eastAsia="Arial" w:cs="Times New Roman"/>
           <w:color w:val="000000" w:themeColor="text1"/>
@@ -6222,12 +6168,72 @@
             </w14:solidFill>
           </w14:textFill>
         </w:rPr>
+      </w:pPr>
+      <w:r>
+        <w:rPr>
+          <w:rFonts w:hint="default" w:ascii="Times New Roman" w:hAnsi="Times New Roman" w:eastAsia="Arial" w:cs="Times New Roman"/>
+          <w:color w:val="000000" w:themeColor="text1"/>
+          <w:kern w:val="0"/>
+          <w:sz w:val="22"/>
+          <w:szCs w:val="22"/>
+          <w:u w:val="none"/>
+          <w:lang w:val="en-IN" w:eastAsia="zh-CN" w:bidi="ar"/>
+          <w14:textFill>
+            <w14:solidFill>
+              <w14:schemeClr w14:val="tx1"/>
+            </w14:solidFill>
+          </w14:textFill>
+        </w:rPr>
+        <w:t>Example:</w:t>
+      </w:r>
+    </w:p>
+    <w:p>
+      <w:pPr>
+        <w:keepNext w:val="0"/>
+        <w:keepLines w:val="0"/>
+        <w:widowControl/>
+        <w:suppressLineNumbers w:val="0"/>
+        <w:pBdr>
+          <w:bottom w:val="none" w:color="EEF0FF" w:sz="0" w:space="0"/>
+        </w:pBdr>
+        <w:spacing w:before="144" w:beforeAutospacing="0" w:after="192" w:afterAutospacing="0"/>
+        <w:ind w:left="0" w:right="0"/>
+        <w:jc w:val="both"/>
+        <w:rPr>
+          <w:rFonts w:hint="default" w:ascii="Times New Roman" w:hAnsi="Times New Roman" w:eastAsia="Arial" w:cs="Times New Roman"/>
+          <w:color w:val="000000" w:themeColor="text1"/>
+          <w:sz w:val="22"/>
+          <w:szCs w:val="22"/>
+          <w:u w:val="none"/>
+          <w14:textFill>
+            <w14:solidFill>
+              <w14:schemeClr w14:val="tx1"/>
+            </w14:solidFill>
+          </w14:textFill>
+        </w:rPr>
+      </w:pPr>
+      <w:r>
+        <w:rPr>
+          <w:rFonts w:hint="default" w:ascii="Times New Roman" w:hAnsi="Times New Roman" w:eastAsia="Arial" w:cs="Times New Roman"/>
+          <w:color w:val="000000" w:themeColor="text1"/>
+          <w:kern w:val="0"/>
+          <w:sz w:val="22"/>
+          <w:szCs w:val="22"/>
+          <w:u w:val="none"/>
+          <w:lang w:val="en-IN" w:eastAsia="zh-CN" w:bidi="ar"/>
+          <w14:textFill>
+            <w14:solidFill>
+              <w14:schemeClr w14:val="tx1"/>
+            </w14:solidFill>
+          </w14:textFill>
+        </w:rPr>
         <w:t>HTML code is</w:t>
       </w:r>
     </w:p>
     <w:p>
       <w:pPr>
         <w:numPr>
+          <w:ilvl w:val="0"/>
           <w:numId w:val="0"/>
         </w:numPr>
         <w:spacing w:line="240" w:lineRule="auto"/>
@@ -6259,6 +6265,7 @@
     <w:p>
       <w:pPr>
         <w:numPr>
+          <w:ilvl w:val="0"/>
           <w:numId w:val="0"/>
         </w:numPr>
         <w:spacing w:line="240" w:lineRule="auto"/>
@@ -6290,6 +6297,7 @@
     <w:p>
       <w:pPr>
         <w:numPr>
+          <w:ilvl w:val="0"/>
           <w:numId w:val="0"/>
         </w:numPr>
         <w:spacing w:line="240" w:lineRule="auto"/>
@@ -6321,6 +6329,7 @@
     <w:p>
       <w:pPr>
         <w:numPr>
+          <w:ilvl w:val="0"/>
           <w:numId w:val="0"/>
         </w:numPr>
         <w:spacing w:line="240" w:lineRule="auto"/>
@@ -6352,6 +6361,7 @@
     <w:p>
       <w:pPr>
         <w:numPr>
+          <w:ilvl w:val="0"/>
           <w:numId w:val="0"/>
         </w:numPr>
         <w:spacing w:line="240" w:lineRule="auto"/>
@@ -6383,6 +6393,7 @@
     <w:p>
       <w:pPr>
         <w:numPr>
+          <w:ilvl w:val="0"/>
           <w:numId w:val="0"/>
         </w:numPr>
         <w:spacing w:line="240" w:lineRule="auto"/>
@@ -6402,6 +6413,7 @@
     <w:p>
       <w:pPr>
         <w:numPr>
+          <w:ilvl w:val="0"/>
           <w:numId w:val="0"/>
         </w:numPr>
         <w:spacing w:line="240" w:lineRule="auto"/>
@@ -6435,6 +6447,7 @@
     <w:p>
       <w:pPr>
         <w:numPr>
+          <w:ilvl w:val="0"/>
           <w:numId w:val="0"/>
         </w:numPr>
         <w:spacing w:line="240" w:lineRule="auto"/>
@@ -6455,6 +6468,7 @@
     <w:p>
       <w:pPr>
         <w:numPr>
+          <w:ilvl w:val="0"/>
           <w:numId w:val="0"/>
         </w:numPr>
         <w:spacing w:line="240" w:lineRule="auto"/>
@@ -6488,6 +6502,7 @@
     <w:p>
       <w:pPr>
         <w:numPr>
+          <w:ilvl w:val="0"/>
           <w:numId w:val="0"/>
         </w:numPr>
         <w:spacing w:line="240" w:lineRule="auto"/>
@@ -6508,6 +6523,7 @@
     <w:p>
       <w:pPr>
         <w:numPr>
+          <w:ilvl w:val="0"/>
           <w:numId w:val="0"/>
         </w:numPr>
         <w:spacing w:line="240" w:lineRule="auto"/>
@@ -6541,6 +6557,7 @@
     <w:p>
       <w:pPr>
         <w:numPr>
+          <w:ilvl w:val="0"/>
           <w:numId w:val="0"/>
         </w:numPr>
         <w:spacing w:line="240" w:lineRule="auto"/>
@@ -6574,6 +6591,7 @@
     <w:p>
       <w:pPr>
         <w:numPr>
+          <w:ilvl w:val="0"/>
           <w:numId w:val="0"/>
         </w:numPr>
         <w:spacing w:line="240" w:lineRule="auto"/>
@@ -6594,6 +6612,7 @@
     <w:p>
       <w:pPr>
         <w:numPr>
+          <w:ilvl w:val="0"/>
           <w:numId w:val="0"/>
         </w:numPr>
         <w:spacing w:line="240" w:lineRule="auto"/>
@@ -6627,6 +6646,7 @@
     <w:p>
       <w:pPr>
         <w:numPr>
+          <w:ilvl w:val="0"/>
           <w:numId w:val="0"/>
         </w:numPr>
         <w:spacing w:line="240" w:lineRule="auto"/>
@@ -6660,6 +6680,7 @@
     <w:p>
       <w:pPr>
         <w:numPr>
+          <w:ilvl w:val="0"/>
           <w:numId w:val="0"/>
         </w:numPr>
         <w:spacing w:line="240" w:lineRule="auto"/>
@@ -6680,6 +6701,7 @@
     <w:p>
       <w:pPr>
         <w:numPr>
+          <w:ilvl w:val="0"/>
           <w:numId w:val="0"/>
         </w:numPr>
         <w:spacing w:line="240" w:lineRule="auto"/>
@@ -6713,6 +6735,7 @@
     <w:p>
       <w:pPr>
         <w:numPr>
+          <w:ilvl w:val="0"/>
           <w:numId w:val="0"/>
         </w:numPr>
         <w:spacing w:line="240" w:lineRule="auto"/>
@@ -6746,6 +6769,7 @@
     <w:p>
       <w:pPr>
         <w:numPr>
+          <w:ilvl w:val="0"/>
           <w:numId w:val="0"/>
         </w:numPr>
         <w:spacing w:line="240" w:lineRule="auto"/>
@@ -7016,6 +7040,7 @@
         <w:keepLines w:val="0"/>
         <w:widowControl/>
         <w:numPr>
+          <w:ilvl w:val="0"/>
           <w:numId w:val="0"/>
         </w:numPr>
         <w:suppressLineNumbers w:val="0"/>
@@ -7175,6 +7200,7 @@
         <w:keepLines w:val="0"/>
         <w:widowControl/>
         <w:numPr>
+          <w:ilvl w:val="0"/>
           <w:numId w:val="0"/>
         </w:numPr>
         <w:suppressLineNumbers w:val="0"/>
@@ -7335,6 +7361,7 @@
         <w:keepLines w:val="0"/>
         <w:widowControl/>
         <w:numPr>
+          <w:ilvl w:val="0"/>
           <w:numId w:val="0"/>
         </w:numPr>
         <w:suppressLineNumbers w:val="0"/>
@@ -7640,6 +7667,7 @@
           </w:tcPr>
           <w:p>
             <w:pPr>
+              <w:widowControl w:val="0"/>
               <w:numPr>
                 <w:ilvl w:val="0"/>
                 <w:numId w:val="0"/>
@@ -7685,6 +7713,7 @@
           </w:tcPr>
           <w:p>
             <w:pPr>
+              <w:widowControl w:val="0"/>
               <w:numPr>
                 <w:ilvl w:val="0"/>
                 <w:numId w:val="0"/>
@@ -7731,6 +7760,7 @@
           </w:tcPr>
           <w:p>
             <w:pPr>
+              <w:widowControl w:val="0"/>
               <w:numPr>
                 <w:ilvl w:val="0"/>
                 <w:numId w:val="0"/>
@@ -7777,6 +7807,7 @@
           </w:tcPr>
           <w:p>
             <w:pPr>
+              <w:widowControl w:val="0"/>
               <w:numPr>
                 <w:ilvl w:val="0"/>
                 <w:numId w:val="0"/>
@@ -7822,6 +7853,7 @@
           </w:tcPr>
           <w:p>
             <w:pPr>
+              <w:widowControl w:val="0"/>
               <w:numPr>
                 <w:ilvl w:val="0"/>
                 <w:numId w:val="0"/>
@@ -7885,6 +7917,7 @@
           </w:tcPr>
           <w:p>
             <w:pPr>
+              <w:widowControl w:val="0"/>
               <w:numPr>
                 <w:ilvl w:val="0"/>
                 <w:numId w:val="0"/>
@@ -7931,6 +7964,7 @@
           </w:tcPr>
           <w:p>
             <w:pPr>
+              <w:widowControl w:val="0"/>
               <w:numPr>
                 <w:ilvl w:val="0"/>
                 <w:numId w:val="0"/>
@@ -7980,6 +8014,7 @@
           </w:tcPr>
           <w:p>
             <w:pPr>
+              <w:widowControl w:val="0"/>
               <w:numPr>
                 <w:ilvl w:val="0"/>
                 <w:numId w:val="0"/>
@@ -8025,6 +8060,7 @@
           </w:tcPr>
           <w:p>
             <w:pPr>
+              <w:widowControl w:val="0"/>
               <w:numPr>
                 <w:ilvl w:val="0"/>
                 <w:numId w:val="0"/>
@@ -8067,6 +8103,7 @@
           </w:tcPr>
           <w:p>
             <w:pPr>
+              <w:widowControl w:val="0"/>
               <w:numPr>
                 <w:ilvl w:val="0"/>
                 <w:numId w:val="0"/>
@@ -8144,6 +8181,7 @@
           </w:tcPr>
           <w:p>
             <w:pPr>
+              <w:widowControl w:val="0"/>
               <w:numPr>
                 <w:ilvl w:val="0"/>
                 <w:numId w:val="0"/>
@@ -8193,6 +8231,7 @@
           </w:tcPr>
           <w:p>
             <w:pPr>
+              <w:widowControl w:val="0"/>
               <w:numPr>
                 <w:ilvl w:val="0"/>
                 <w:numId w:val="0"/>
@@ -8242,6 +8281,7 @@
           </w:tcPr>
           <w:p>
             <w:pPr>
+              <w:widowControl w:val="0"/>
               <w:numPr>
                 <w:ilvl w:val="0"/>
                 <w:numId w:val="0"/>
@@ -8287,6 +8327,7 @@
           </w:tcPr>
           <w:p>
             <w:pPr>
+              <w:widowControl w:val="0"/>
               <w:numPr>
                 <w:ilvl w:val="0"/>
                 <w:numId w:val="0"/>
@@ -8333,6 +8374,7 @@
           </w:tcPr>
           <w:p>
             <w:pPr>
+              <w:widowControl w:val="0"/>
               <w:numPr>
                 <w:ilvl w:val="0"/>
                 <w:numId w:val="0"/>
@@ -8414,6 +8456,7 @@
           </w:tcPr>
           <w:p>
             <w:pPr>
+              <w:widowControl w:val="0"/>
               <w:numPr>
                 <w:ilvl w:val="0"/>
                 <w:numId w:val="0"/>
@@ -8464,6 +8507,7 @@
           </w:tcPr>
           <w:p>
             <w:pPr>
+              <w:widowControl w:val="0"/>
               <w:numPr>
                 <w:ilvl w:val="0"/>
                 <w:numId w:val="0"/>
@@ -8507,6 +8551,7 @@
           </w:tcPr>
           <w:p>
             <w:pPr>
+              <w:widowControl w:val="0"/>
               <w:numPr>
                 <w:ilvl w:val="0"/>
                 <w:numId w:val="0"/>
@@ -8553,6 +8598,7 @@
           </w:tcPr>
           <w:p>
             <w:pPr>
+              <w:widowControl w:val="0"/>
               <w:numPr>
                 <w:ilvl w:val="0"/>
                 <w:numId w:val="0"/>
@@ -8599,6 +8645,7 @@
           </w:tcPr>
           <w:p>
             <w:pPr>
+              <w:widowControl w:val="0"/>
               <w:numPr>
                 <w:ilvl w:val="0"/>
                 <w:numId w:val="0"/>
@@ -8904,24 +8951,7 @@
           <w:u w:val="none"/>
           <w:lang w:val="en-US" w:eastAsia="zh-CN" w:bidi="ar"/>
         </w:rPr>
-        <w:t xml:space="preserve"> of the parent ele</w:t>
-      </w:r>
-      <w:bookmarkStart w:id="0" w:name="_GoBack"/>
-      <w:bookmarkEnd w:id="0"/>
-      <w:r>
-        <w:rPr>
-          <w:rFonts w:hint="default" w:ascii="Times New Roman" w:hAnsi="Times New Roman" w:eastAsia="Arial" w:cs="Times New Roman"/>
-          <w:b w:val="0"/>
-          <w:bCs w:val="0"/>
-          <w:i w:val="0"/>
-          <w:iCs w:val="0"/>
-          <w:kern w:val="0"/>
-          <w:sz w:val="22"/>
-          <w:szCs w:val="22"/>
-          <w:u w:val="none"/>
-          <w:lang w:val="en-US" w:eastAsia="zh-CN" w:bidi="ar"/>
-        </w:rPr>
-        <w:t>ment. It will not look further down into nested sub-elements.</w:t>
+        <w:t xml:space="preserve"> of the parent element. It will not look further down into nested sub-elements.</w:t>
       </w:r>
     </w:p>
     <w:p>
@@ -9034,6 +9064,7 @@
         <w:keepLines w:val="0"/>
         <w:widowControl/>
         <w:numPr>
+          <w:ilvl w:val="0"/>
           <w:numId w:val="0"/>
         </w:numPr>
         <w:suppressLineNumbers w:val="0"/>
@@ -9076,6 +9107,7 @@
         <w:keepLines w:val="0"/>
         <w:widowControl/>
         <w:numPr>
+          <w:ilvl w:val="0"/>
           <w:numId w:val="0"/>
         </w:numPr>
         <w:suppressLineNumbers w:val="0"/>
@@ -9147,6 +9179,7 @@
         <w:keepLines w:val="0"/>
         <w:widowControl/>
         <w:numPr>
+          <w:ilvl w:val="0"/>
           <w:numId w:val="0"/>
         </w:numPr>
         <w:suppressLineNumbers w:val="0"/>
@@ -9189,6 +9222,7 @@
         <w:keepLines w:val="0"/>
         <w:widowControl/>
         <w:numPr>
+          <w:ilvl w:val="0"/>
           <w:numId w:val="0"/>
         </w:numPr>
         <w:suppressLineNumbers w:val="0"/>
@@ -9274,6 +9308,7 @@
         <w:keepLines w:val="0"/>
         <w:widowControl/>
         <w:numPr>
+          <w:ilvl w:val="0"/>
           <w:numId w:val="0"/>
         </w:numPr>
         <w:suppressLineNumbers w:val="0"/>
@@ -9316,6 +9351,7 @@
         <w:keepLines w:val="0"/>
         <w:widowControl/>
         <w:numPr>
+          <w:ilvl w:val="0"/>
           <w:numId w:val="0"/>
         </w:numPr>
         <w:suppressLineNumbers w:val="0"/>
@@ -9358,6 +9394,7 @@
         <w:keepLines w:val="0"/>
         <w:widowControl/>
         <w:numPr>
+          <w:ilvl w:val="0"/>
           <w:numId w:val="0"/>
         </w:numPr>
         <w:suppressLineNumbers w:val="0"/>
@@ -9539,6 +9576,7 @@
         <w:keepLines w:val="0"/>
         <w:widowControl/>
         <w:numPr>
+          <w:ilvl w:val="0"/>
           <w:numId w:val="0"/>
         </w:numPr>
         <w:suppressLineNumbers w:val="0"/>
@@ -9735,6 +9773,7 @@
     <w:p>
       <w:pPr>
         <w:numPr>
+          <w:ilvl w:val="0"/>
           <w:numId w:val="0"/>
         </w:numPr>
         <w:spacing w:line="240" w:lineRule="auto"/>
@@ -9791,6 +9830,7 @@
     <w:p>
       <w:pPr>
         <w:numPr>
+          <w:ilvl w:val="0"/>
           <w:numId w:val="0"/>
         </w:numPr>
         <w:spacing w:line="240" w:lineRule="auto"/>
@@ -9848,6 +9888,7 @@
     <w:p>
       <w:pPr>
         <w:numPr>
+          <w:ilvl w:val="0"/>
           <w:numId w:val="0"/>
         </w:numPr>
         <w:spacing w:line="240" w:lineRule="auto"/>
@@ -9905,6 +9946,7 @@
     <w:p>
       <w:pPr>
         <w:numPr>
+          <w:ilvl w:val="0"/>
           <w:numId w:val="0"/>
         </w:numPr>
         <w:spacing w:line="240" w:lineRule="auto"/>
@@ -9966,6 +10008,7 @@
     <w:p>
       <w:pPr>
         <w:numPr>
+          <w:ilvl w:val="0"/>
           <w:numId w:val="0"/>
         </w:numPr>
         <w:spacing w:line="240" w:lineRule="auto"/>
@@ -10035,6 +10078,7 @@
     <w:p>
       <w:pPr>
         <w:numPr>
+          <w:ilvl w:val="0"/>
           <w:numId w:val="0"/>
         </w:numPr>
         <w:spacing w:line="240" w:lineRule="auto"/>
@@ -10116,6 +10160,7 @@
     <w:p>
       <w:pPr>
         <w:numPr>
+          <w:ilvl w:val="0"/>
           <w:numId w:val="0"/>
         </w:numPr>
         <w:spacing w:line="240" w:lineRule="auto"/>
@@ -10268,6 +10313,7 @@
     <w:p>
       <w:pPr>
         <w:numPr>
+          <w:ilvl w:val="0"/>
           <w:numId w:val="0"/>
         </w:numPr>
         <w:spacing w:line="240" w:lineRule="auto"/>
@@ -10300,6 +10346,7 @@
     <w:p>
       <w:pPr>
         <w:numPr>
+          <w:ilvl w:val="0"/>
           <w:numId w:val="0"/>
         </w:numPr>
         <w:spacing w:line="240" w:lineRule="auto"/>
@@ -10332,6 +10379,7 @@
     <w:p>
       <w:pPr>
         <w:numPr>
+          <w:ilvl w:val="0"/>
           <w:numId w:val="0"/>
         </w:numPr>
         <w:spacing w:line="240" w:lineRule="auto"/>
@@ -10431,6 +10479,7 @@
     <w:p>
       <w:pPr>
         <w:numPr>
+          <w:ilvl w:val="0"/>
           <w:numId w:val="0"/>
         </w:numPr>
         <w:spacing w:line="240" w:lineRule="auto"/>
@@ -10544,6 +10593,7 @@
     <w:p>
       <w:pPr>
         <w:numPr>
+          <w:ilvl w:val="0"/>
           <w:numId w:val="0"/>
         </w:numPr>
         <w:spacing w:line="240" w:lineRule="auto"/>
@@ -10576,6 +10626,7 @@
     <w:p>
       <w:pPr>
         <w:numPr>
+          <w:ilvl w:val="0"/>
           <w:numId w:val="0"/>
         </w:numPr>
         <w:spacing w:line="240" w:lineRule="auto"/>
@@ -10608,6 +10659,7 @@
     <w:p>
       <w:pPr>
         <w:numPr>
+          <w:ilvl w:val="0"/>
           <w:numId w:val="0"/>
         </w:numPr>
         <w:spacing w:line="240" w:lineRule="auto"/>
@@ -10640,6 +10692,7 @@
     <w:p>
       <w:pPr>
         <w:numPr>
+          <w:ilvl w:val="0"/>
           <w:numId w:val="0"/>
         </w:numPr>
         <w:spacing w:line="240" w:lineRule="auto"/>
@@ -10674,6 +10727,7 @@
     <w:p>
       <w:pPr>
         <w:numPr>
+          <w:ilvl w:val="0"/>
           <w:numId w:val="0"/>
         </w:numPr>
         <w:spacing w:line="240" w:lineRule="auto"/>
@@ -10708,6 +10762,7 @@
     <w:p>
       <w:pPr>
         <w:numPr>
+          <w:ilvl w:val="0"/>
           <w:numId w:val="0"/>
         </w:numPr>
         <w:spacing w:line="240" w:lineRule="auto"/>
@@ -10775,6 +10830,7 @@
     <w:p>
       <w:pPr>
         <w:numPr>
+          <w:ilvl w:val="0"/>
           <w:numId w:val="0"/>
         </w:numPr>
         <w:spacing w:line="240" w:lineRule="auto"/>
@@ -11899,18 +11955,18 @@
     <w:lsdException w:unhideWhenUsed="0" w:uiPriority="0" w:semiHidden="0" w:name="Document Map"/>
     <w:lsdException w:unhideWhenUsed="0" w:uiPriority="0" w:semiHidden="0" w:name="Plain Text"/>
     <w:lsdException w:unhideWhenUsed="0" w:uiPriority="0" w:semiHidden="0" w:name="E-mail Signature"/>
-    <w:lsdException w:unhideWhenUsed="0" w:uiPriority="0" w:semiHidden="0" w:name="Normal (Web)"/>
+    <w:lsdException w:qFormat="1" w:unhideWhenUsed="0" w:uiPriority="0" w:semiHidden="0" w:name="Normal (Web)"/>
     <w:lsdException w:unhideWhenUsed="0" w:uiPriority="0" w:semiHidden="0" w:name="HTML Acronym"/>
     <w:lsdException w:unhideWhenUsed="0" w:uiPriority="0" w:semiHidden="0" w:name="HTML Address"/>
     <w:lsdException w:unhideWhenUsed="0" w:uiPriority="0" w:semiHidden="0" w:name="HTML Cite"/>
-    <w:lsdException w:unhideWhenUsed="0" w:uiPriority="0" w:semiHidden="0" w:name="HTML Code"/>
+    <w:lsdException w:qFormat="1" w:unhideWhenUsed="0" w:uiPriority="0" w:semiHidden="0" w:name="HTML Code"/>
     <w:lsdException w:unhideWhenUsed="0" w:uiPriority="0" w:semiHidden="0" w:name="HTML Definition"/>
     <w:lsdException w:unhideWhenUsed="0" w:uiPriority="0" w:semiHidden="0" w:name="HTML Keyboard"/>
     <w:lsdException w:unhideWhenUsed="0" w:uiPriority="0" w:semiHidden="0" w:name="HTML Preformatted"/>
     <w:lsdException w:unhideWhenUsed="0" w:uiPriority="0" w:semiHidden="0" w:name="HTML Sample"/>
     <w:lsdException w:unhideWhenUsed="0" w:uiPriority="0" w:semiHidden="0" w:name="HTML Typewriter"/>
     <w:lsdException w:unhideWhenUsed="0" w:uiPriority="0" w:semiHidden="0" w:name="HTML Variable"/>
-    <w:lsdException w:unhideWhenUsed="0" w:uiPriority="0" w:name="Normal Table"/>
+    <w:lsdException w:qFormat="1" w:unhideWhenUsed="0" w:uiPriority="0" w:name="Normal Table"/>
     <w:lsdException w:unhideWhenUsed="0" w:uiPriority="0" w:semiHidden="0" w:name="annotation subject"/>
     <w:lsdException w:unhideWhenUsed="0" w:uiPriority="0" w:semiHidden="0" w:name="Table Simple 1"/>
     <w:lsdException w:unhideWhenUsed="0" w:uiPriority="0" w:semiHidden="0" w:name="Table Simple 2"/>
@@ -11955,7 +12011,7 @@
     <w:lsdException w:unhideWhenUsed="0" w:uiPriority="0" w:semiHidden="0" w:name="Table Web 2"/>
     <w:lsdException w:unhideWhenUsed="0" w:uiPriority="0" w:semiHidden="0" w:name="Table Web 3"/>
     <w:lsdException w:unhideWhenUsed="0" w:uiPriority="0" w:semiHidden="0" w:name="Balloon Text"/>
-    <w:lsdException w:unhideWhenUsed="0" w:uiPriority="0" w:semiHidden="0" w:name="Table Grid"/>
+    <w:lsdException w:qFormat="1" w:unhideWhenUsed="0" w:uiPriority="0" w:semiHidden="0" w:name="Table Grid"/>
     <w:lsdException w:unhideWhenUsed="0" w:uiPriority="0" w:semiHidden="0" w:name="Table Theme"/>
     <w:lsdException w:unhideWhenUsed="0" w:uiPriority="60" w:semiHidden="0" w:name="Light Shading"/>
     <w:lsdException w:unhideWhenUsed="0" w:uiPriority="61" w:semiHidden="0" w:name="Light List"/>
@@ -12135,6 +12191,7 @@
   <w:style w:type="table" w:default="1" w:styleId="6">
     <w:name w:val="Normal Table"/>
     <w:semiHidden/>
+    <w:qFormat/>
     <w:uiPriority w:val="0"/>
     <w:tblPr>
       <w:tblCellMar>
@@ -12158,6 +12215,7 @@
   <w:style w:type="character" w:styleId="8">
     <w:name w:val="HTML Code"/>
     <w:basedOn w:val="5"/>
+    <w:qFormat/>
     <w:uiPriority w:val="0"/>
     <w:rPr>
       <w:rFonts w:ascii="Courier New" w:hAnsi="Courier New" w:cs="Courier New"/>
@@ -12199,6 +12257,7 @@
   </w:style>
   <w:style w:type="paragraph" w:styleId="10">
     <w:name w:val="Normal (Web)"/>
+    <w:qFormat/>
     <w:uiPriority w:val="0"/>
     <w:pPr>
       <w:spacing w:before="0" w:beforeAutospacing="1" w:after="0" w:afterAutospacing="1"/>
@@ -12206,6 +12265,7 @@
       <w:jc w:val="left"/>
     </w:pPr>
     <w:rPr>
+      <w:rFonts w:ascii="Times New Roman" w:hAnsi="Times New Roman" w:eastAsia="SimSun" w:cs="Times New Roman"/>
       <w:kern w:val="0"/>
       <w:sz w:val="24"/>
       <w:szCs w:val="24"/>
@@ -12225,6 +12285,7 @@
   <w:style w:type="table" w:styleId="12">
     <w:name w:val="Table Grid"/>
     <w:basedOn w:val="6"/>
+    <w:qFormat/>
     <w:uiPriority w:val="0"/>
     <w:pPr>
       <w:widowControl w:val="0"/>

</xml_diff>